<commit_message>
fix(manual): close final review findings before merge
- build-docx.ts: add compile-time exhaustiveness check on the Block
  switch so a future unhandled kind fails typecheck instead of
  silently dropping content from the printed manual
- manual-content.test.ts: add the reverse slug/screen assertion —
  every screen in SCREENS must be referenced by a figure block, not
  just the existing figure-references-a-known-screen direction
- README: correct the validation description now that both
  directions are actually enforced
- content.ts: quote the exact confirmed button labels (Add Tax Rate,
  Add User, Add New Product, Make Payment) instead of generic
  phrasing, and regenerate the .docx with the corrected wording

Co-Authored-By: Claude Opus 5 <noreply@anthropic.com>
</commit_message>
<xml_diff>
--- a/docs/manual/VerdixPOS-User-Manual.docx
+++ b/docs/manual/VerdixPOS-User-Manual.docx
@@ -1627,7 +1627,7 @@
         <w:spacing w:after="80"/>
       </w:pPr>
       <w:r>
-        <w:t xml:space="preserve">On the Products page, click the button to add a new product.</w:t>
+        <w:t xml:space="preserve">On the Products page, click the "Add New Product" button.</w:t>
       </w:r>
     </w:p>
     <w:p>
@@ -2835,7 +2835,7 @@
         <w:spacing w:after="80"/>
       </w:pPr>
       <w:r>
-        <w:t xml:space="preserve">Click into a supplier's row to view their transaction history, or use the make-payment action to record a payment against their balance.</w:t>
+        <w:t xml:space="preserve">Click into a supplier's row to view their transaction history, or use the "Make Payment" action to record a payment against their balance.</w:t>
       </w:r>
     </w:p>
     <w:p>
@@ -5597,7 +5597,7 @@
         <w:spacing w:after="80"/>
       </w:pPr>
       <w:r>
-        <w:t xml:space="preserve">Click the button to add a new tax rate, or use the edit action on an existing rate.</w:t>
+        <w:t xml:space="preserve">Click the "Add Tax Rate" button, or use the edit action on an existing rate.</w:t>
       </w:r>
     </w:p>
     <w:p>
@@ -5754,7 +5754,7 @@
         <w:spacing w:after="80"/>
       </w:pPr>
       <w:r>
-        <w:t xml:space="preserve">Click the button to add a new user, filling in their name, username, password, and user type.</w:t>
+        <w:t xml:space="preserve">Click the "Add User" button, filling in their name, username, password, and user type.</w:t>
       </w:r>
     </w:p>
     <w:p>

</xml_diff>

<commit_message>
docs(manual): explain the highest-wins cost/retail rule on receiving
Receiving a delivery never lowers a product's cost or retail price. Both
follow Math.max(existing, new) in lib/purchase-actions.ts, so a cheaper
delivery leaves the previous higher figures in place.

Documents the rule with a comparison table and a worked example, notes
that the cost compared is landed cost (item cost + share of shipping),
and clarifies that FIFO batches still record the real price paid so
profit reports stay accurate.

Co-Authored-By: Claude Opus 5 <noreply@anthropic.com>
</commit_message>
<xml_diff>
--- a/docs/manual/VerdixPOS-User-Manual.docx
+++ b/docs/manual/VerdixPOS-User-Manual.docx
@@ -2645,6 +2645,354 @@
         <w:t xml:space="preserve">Once goods arrive, open the order and use the receive action to record the delivery. This updates stock levels through the FIFO batch system — new stock is added as a new cost batch, and future sales will still deplete the oldest batch first before touching this new stock.</w:t>
       </w:r>
     </w:p>
+    <w:p>
+      <w:pPr>
+        <w:pStyle w:val="Heading2"/>
+        <w:spacing w:before="200"/>
+      </w:pPr>
+      <w:r>
+        <w:t xml:space="preserve">How receiving a delivery changes cost and retail price</w:t>
+      </w:r>
+    </w:p>
+    <w:p>
+      <w:pPr>
+        <w:spacing w:after="160"/>
+      </w:pPr>
+      <w:r>
+        <w:t xml:space="preserve">When you receive a delivery, Verdix does not simply overwrite the product's cost and retail price with whatever is on the new purchase order. It follows one simple rule, which applies to the cost and the retail price separately: the higher value always wins.</w:t>
+      </w:r>
+    </w:p>
+    <w:p>
+      <w:pPr>
+        <w:spacing w:after="160"/>
+      </w:pPr>
+      <w:r>
+        <w:t xml:space="preserve">In other words, a delivery can raise a product's cost and retail price, but it can never lower them. If your supplier charges more this time, the product takes the new, higher cost and retail price. If your supplier charges less this time, the product keeps the older, higher figures it already had.</w:t>
+      </w:r>
+    </w:p>
+    <w:tbl>
+      <w:tblPr>
+        <w:tblW w:type="pct" w:w="100%"/>
+        <w:tblBorders>
+          <w:top w:val="single" w:color="888888" w:sz="2"/>
+          <w:left w:val="single" w:color="888888" w:sz="2"/>
+          <w:bottom w:val="single" w:color="888888" w:sz="2"/>
+          <w:right w:val="single" w:color="888888" w:sz="2"/>
+          <w:insideH w:val="single" w:color="888888" w:sz="2"/>
+          <w:insideV w:val="single" w:color="888888" w:sz="2"/>
+        </w:tblBorders>
+      </w:tblPr>
+      <w:tblGrid>
+        <w:gridCol w:w="100"/>
+        <w:gridCol w:w="100"/>
+      </w:tblGrid>
+      <w:tr>
+        <w:trPr>
+          <w:tblHeader/>
+        </w:trPr>
+        <w:tc>
+          <w:tcPr>
+            <w:shd w:fill="DDDDDD" w:color="auto" w:val="clear"/>
+            <w:tcMar>
+              <w:top w:type="dxa" w:w="80"/>
+              <w:left w:type="dxa" w:w="100"/>
+              <w:bottom w:type="dxa" w:w="80"/>
+              <w:right w:type="dxa" w:w="100"/>
+            </w:tcMar>
+          </w:tcPr>
+          <w:p>
+            <w:r>
+              <w:rPr>
+                <w:b/>
+                <w:bCs/>
+              </w:rPr>
+              <w:t xml:space="preserve">What happened on the new delivery</w:t>
+            </w:r>
+          </w:p>
+        </w:tc>
+        <w:tc>
+          <w:tcPr>
+            <w:shd w:fill="DDDDDD" w:color="auto" w:val="clear"/>
+            <w:tcMar>
+              <w:top w:type="dxa" w:w="80"/>
+              <w:left w:type="dxa" w:w="100"/>
+              <w:bottom w:type="dxa" w:w="80"/>
+              <w:right w:type="dxa" w:w="100"/>
+            </w:tcMar>
+          </w:tcPr>
+          <w:p>
+            <w:r>
+              <w:rPr>
+                <w:b/>
+                <w:bCs/>
+              </w:rPr>
+              <w:t xml:space="preserve">What the product ends up with</w:t>
+            </w:r>
+          </w:p>
+        </w:tc>
+      </w:tr>
+      <w:tr>
+        <w:tc>
+          <w:tcPr>
+            <w:tcMar>
+              <w:top w:type="dxa" w:w="80"/>
+              <w:left w:type="dxa" w:w="100"/>
+              <w:bottom w:type="dxa" w:w="80"/>
+              <w:right w:type="dxa" w:w="100"/>
+            </w:tcMar>
+          </w:tcPr>
+          <w:p>
+            <w:r>
+              <w:t xml:space="preserve">New cost is HIGHER than the current cost</w:t>
+            </w:r>
+          </w:p>
+        </w:tc>
+        <w:tc>
+          <w:tcPr>
+            <w:tcMar>
+              <w:top w:type="dxa" w:w="80"/>
+              <w:left w:type="dxa" w:w="100"/>
+              <w:bottom w:type="dxa" w:w="80"/>
+              <w:right w:type="dxa" w:w="100"/>
+            </w:tcMar>
+          </w:tcPr>
+          <w:p>
+            <w:r>
+              <w:t xml:space="preserve">The product takes the new, higher cost.</w:t>
+            </w:r>
+          </w:p>
+        </w:tc>
+      </w:tr>
+      <w:tr>
+        <w:tc>
+          <w:tcPr>
+            <w:tcMar>
+              <w:top w:type="dxa" w:w="80"/>
+              <w:left w:type="dxa" w:w="100"/>
+              <w:bottom w:type="dxa" w:w="80"/>
+              <w:right w:type="dxa" w:w="100"/>
+            </w:tcMar>
+          </w:tcPr>
+          <w:p>
+            <w:r>
+              <w:t xml:space="preserve">New cost is LOWER than the current cost</w:t>
+            </w:r>
+          </w:p>
+        </w:tc>
+        <w:tc>
+          <w:tcPr>
+            <w:tcMar>
+              <w:top w:type="dxa" w:w="80"/>
+              <w:left w:type="dxa" w:w="100"/>
+              <w:bottom w:type="dxa" w:w="80"/>
+              <w:right w:type="dxa" w:w="100"/>
+            </w:tcMar>
+          </w:tcPr>
+          <w:p>
+            <w:r>
+              <w:t xml:space="preserve">The product keeps its existing, higher cost. The new lower cost is ignored.</w:t>
+            </w:r>
+          </w:p>
+        </w:tc>
+      </w:tr>
+      <w:tr>
+        <w:tc>
+          <w:tcPr>
+            <w:tcMar>
+              <w:top w:type="dxa" w:w="80"/>
+              <w:left w:type="dxa" w:w="100"/>
+              <w:bottom w:type="dxa" w:w="80"/>
+              <w:right w:type="dxa" w:w="100"/>
+            </w:tcMar>
+          </w:tcPr>
+          <w:p>
+            <w:r>
+              <w:t xml:space="preserve">New retail price is HIGHER than the current retail price</w:t>
+            </w:r>
+          </w:p>
+        </w:tc>
+        <w:tc>
+          <w:tcPr>
+            <w:tcMar>
+              <w:top w:type="dxa" w:w="80"/>
+              <w:left w:type="dxa" w:w="100"/>
+              <w:bottom w:type="dxa" w:w="80"/>
+              <w:right w:type="dxa" w:w="100"/>
+            </w:tcMar>
+          </w:tcPr>
+          <w:p>
+            <w:r>
+              <w:t xml:space="preserve">The product takes the new, higher retail price.</w:t>
+            </w:r>
+          </w:p>
+        </w:tc>
+      </w:tr>
+      <w:tr>
+        <w:tc>
+          <w:tcPr>
+            <w:tcMar>
+              <w:top w:type="dxa" w:w="80"/>
+              <w:left w:type="dxa" w:w="100"/>
+              <w:bottom w:type="dxa" w:w="80"/>
+              <w:right w:type="dxa" w:w="100"/>
+            </w:tcMar>
+          </w:tcPr>
+          <w:p>
+            <w:r>
+              <w:t xml:space="preserve">New retail price is LOWER than the current retail price</w:t>
+            </w:r>
+          </w:p>
+        </w:tc>
+        <w:tc>
+          <w:tcPr>
+            <w:tcMar>
+              <w:top w:type="dxa" w:w="80"/>
+              <w:left w:type="dxa" w:w="100"/>
+              <w:bottom w:type="dxa" w:w="80"/>
+              <w:right w:type="dxa" w:w="100"/>
+            </w:tcMar>
+          </w:tcPr>
+          <w:p>
+            <w:r>
+              <w:t xml:space="preserve">The product keeps its existing, higher retail price.</w:t>
+            </w:r>
+          </w:p>
+        </w:tc>
+      </w:tr>
+      <w:tr>
+        <w:tc>
+          <w:tcPr>
+            <w:tcMar>
+              <w:top w:type="dxa" w:w="80"/>
+              <w:left w:type="dxa" w:w="100"/>
+              <w:bottom w:type="dxa" w:w="80"/>
+              <w:right w:type="dxa" w:w="100"/>
+            </w:tcMar>
+          </w:tcPr>
+          <w:p>
+            <w:r>
+              <w:t xml:space="preserve">The retail price is left blank on the purchase order</w:t>
+            </w:r>
+          </w:p>
+        </w:tc>
+        <w:tc>
+          <w:tcPr>
+            <w:tcMar>
+              <w:top w:type="dxa" w:w="80"/>
+              <w:left w:type="dxa" w:w="100"/>
+              <w:bottom w:type="dxa" w:w="80"/>
+              <w:right w:type="dxa" w:w="100"/>
+            </w:tcMar>
+          </w:tcPr>
+          <w:p>
+            <w:r>
+              <w:t xml:space="preserve">The product keeps its existing retail price — a blank price never lowers it.</w:t>
+            </w:r>
+          </w:p>
+        </w:tc>
+      </w:tr>
+    </w:tbl>
+    <w:p/>
+    <w:p>
+      <w:pPr>
+        <w:spacing w:after="160"/>
+      </w:pPr>
+      <w:r>
+        <w:t xml:space="preserve">Here is a worked example. A product currently has a cost of 100 pesos and a retail price of 130 pesos. A delivery arrives where the same product cost 120 pesos, so the cost rises to 120 and, if the purchase order also carries a higher retail price, the retail price rises with it. On the next delivery the supplier charges only 90 pesos. Because 90 is lower than 120, the product keeps its cost of 120 — the cheaper price does not pull it back down.</w:t>
+      </w:r>
+    </w:p>
+    <w:p>
+      <w:pPr>
+        <w:spacing w:after="160"/>
+      </w:pPr>
+      <w:r>
+        <w:t xml:space="preserve">The cost being compared is the landed cost, not just the price on the supplier's invoice. Landed cost is the item cost plus that item's share of the shipping fee entered on the purchase order. So a delivery with a large shipping fee can raise a product's cost even when the supplier's unit price has not changed.</w:t>
+      </w:r>
+    </w:p>
+    <w:tbl>
+      <w:tblPr>
+        <w:tblW w:type="pct" w:w="100%"/>
+        <w:tblBorders>
+          <w:top w:val="single" w:color="999999" w:sz="4"/>
+          <w:left w:val="single" w:color="999999" w:sz="4"/>
+          <w:bottom w:val="single" w:color="999999" w:sz="4"/>
+          <w:right w:val="single" w:color="999999" w:sz="4"/>
+          <w:insideH w:val="single" w:color="auto" w:sz="4"/>
+          <w:insideV w:val="single" w:color="auto" w:sz="4"/>
+        </w:tblBorders>
+      </w:tblPr>
+      <w:tblGrid>
+        <w:gridCol w:w="100"/>
+      </w:tblGrid>
+      <w:tr>
+        <w:tc>
+          <w:tcPr>
+            <w:shd w:fill="FFF3C4" w:color="auto" w:val="clear"/>
+            <w:tcMar>
+              <w:top w:type="dxa" w:w="100"/>
+              <w:left w:type="dxa" w:w="150"/>
+              <w:bottom w:type="dxa" w:w="100"/>
+              <w:right w:type="dxa" w:w="150"/>
+            </w:tcMar>
+          </w:tcPr>
+          <w:p>
+            <w:r>
+              <w:rPr>
+                <w:b/>
+                <w:bCs/>
+              </w:rPr>
+              <w:t xml:space="preserve">Tip: </w:t>
+            </w:r>
+            <w:r>
+              <w:t xml:space="preserve">Tip: This rule protects your selling price from dropping by accident when a supplier happens to give you one cheap delivery. If you genuinely want a product to cost or sell for less, change it yourself on the Products page — receiving a cheaper delivery alone will not do it.</w:t>
+            </w:r>
+          </w:p>
+        </w:tc>
+      </w:tr>
+    </w:tbl>
+    <w:p/>
+    <w:tbl>
+      <w:tblPr>
+        <w:tblW w:type="pct" w:w="100%"/>
+        <w:tblBorders>
+          <w:top w:val="single" w:color="999999" w:sz="4"/>
+          <w:left w:val="single" w:color="999999" w:sz="4"/>
+          <w:bottom w:val="single" w:color="999999" w:sz="4"/>
+          <w:right w:val="single" w:color="999999" w:sz="4"/>
+          <w:insideH w:val="single" w:color="auto" w:sz="4"/>
+          <w:insideV w:val="single" w:color="auto" w:sz="4"/>
+        </w:tblBorders>
+      </w:tblPr>
+      <w:tblGrid>
+        <w:gridCol w:w="100"/>
+      </w:tblGrid>
+      <w:tr>
+        <w:tc>
+          <w:tcPr>
+            <w:shd w:fill="F8D0D0" w:color="auto" w:val="clear"/>
+            <w:tcMar>
+              <w:top w:type="dxa" w:w="100"/>
+              <w:left w:type="dxa" w:w="150"/>
+              <w:bottom w:type="dxa" w:w="100"/>
+              <w:right w:type="dxa" w:w="150"/>
+            </w:tcMar>
+          </w:tcPr>
+          <w:p>
+            <w:r>
+              <w:rPr>
+                <w:b/>
+                <w:bCs/>
+              </w:rPr>
+              <w:t xml:space="preserve">Warning: </w:t>
+            </w:r>
+            <w:r>
+              <w:t xml:space="preserve">Warning: Your profit reports are not distorted by this rule. Each delivery is still stored as its own FIFO cost batch at the real price you actually paid, so batch and profit-margin reports show true costs. The highest-wins rule only affects the single headline cost and retail price shown on the product record.</w:t>
+            </w:r>
+          </w:p>
+        </w:tc>
+      </w:tr>
+    </w:tbl>
+    <w:p/>
     <w:p>
       <w:pPr>
         <w:pStyle w:val="Heading2"/>

</xml_diff>

<commit_message>
docs(manual): rebuild with the membership sections
Three figures render as placeholders until a capture pass runs against a
seeded test DB on port 3100. The prose stands on its own in the meantime.

Co-Authored-By: Claude Opus 5 <noreply@anthropic.com>
</commit_message>
<xml_diff>
--- a/docs/manual/VerdixPOS-User-Manual.docx
+++ b/docs/manual/VerdixPOS-User-Manual.docx
@@ -41,7 +41,7 @@
           <w:sz w:val="22"/>
           <w:szCs w:val="22"/>
         </w:rPr>
-        <w:t xml:space="preserve">Generated July 27, 2026</w:t>
+        <w:t xml:space="preserve">Generated July 28, 2026</w:t>
       </w:r>
     </w:p>
     <w:p>
@@ -1303,6 +1303,14 @@
         <w:t xml:space="preserve">Click "Confirm and End Shift" to close out and hand over the drawer.</w:t>
       </w:r>
     </w:p>
+    <w:p>
+      <w:pPr>
+        <w:spacing w:after="160"/>
+      </w:pPr>
+      <w:r>
+        <w:t xml:space="preserve">If you collected any membership fees in cash during your shift, they appear on their own line, "Membership Fees (cash)", above the "Expected Transfer" total. That money is part of what the drawer should hold, so it is already included in the expected amount you count against.</w:t>
+      </w:r>
+    </w:p>
     <w:tbl>
       <w:tblPr>
         <w:tblW w:type="pct" w:w="100%"/>
@@ -1519,6 +1527,14 @@
         <w:t xml:space="preserve">Figure 10: Z-Reading</w:t>
       </w:r>
     </w:p>
+    <w:p>
+      <w:pPr>
+        <w:spacing w:after="160"/>
+      </w:pPr>
+      <w:r>
+        <w:t xml:space="preserve">When membership fees were collected in cash during the shift, the printed reading slip carries a "Membership (cash)" line with the number of activations and renewals beneath it. Note that this line is on the printed slip — the on-screen report does not show it, so print the reading if you need membership figures for your records.</w:t>
+      </w:r>
+    </w:p>
     <w:tbl>
       <w:tblPr>
         <w:tblW w:type="pct" w:w="100%"/>
@@ -3897,6 +3913,215 @@
     </w:p>
     <w:p>
       <w:pPr>
+        <w:pStyle w:val="Heading2"/>
+        <w:spacing w:before="200"/>
+      </w:pPr>
+      <w:r>
+        <w:t xml:space="preserve">Membership fees</w:t>
+      </w:r>
+    </w:p>
+    <w:p>
+      <w:pPr>
+        <w:spacing w:after="160"/>
+      </w:pPr>
+      <w:r>
+        <w:t xml:space="preserve">A membership fee is what the customer pays to activate a new loyalty card, or to renew one that has run out. It is separate from the points described in the previous section: points are earned and redeemed on purchases, while the membership fee is what keeps the card itself valid for a set number of months. The fee amount and how long a membership lasts are both configured in Settings — see Chapter 9, POS setup.</w:t>
+      </w:r>
+    </w:p>
+    <w:p>
+      <w:pPr>
+        <w:spacing w:after="160"/>
+      </w:pPr>
+      <w:r>
+        <w:t xml:space="preserve">Cashiers collect membership fees at the counter, through the customer panel rather than the cart. A membership payment is never rung up as a cart item.</w:t>
+      </w:r>
+    </w:p>
+    <w:p>
+      <w:pPr>
+        <w:pStyle w:val="ListParagraph"/>
+        <w:numPr>
+          <w:ilvl w:val="0"/>
+          <w:numId w:val="2"/>
+        </w:numPr>
+        <w:spacing w:after="80"/>
+      </w:pPr>
+      <w:r>
+        <w:t xml:space="preserve">At the POS, click "Customer" along the bottom row of buttons.</w:t>
+      </w:r>
+    </w:p>
+    <w:p>
+      <w:pPr>
+        <w:pStyle w:val="ListParagraph"/>
+        <w:numPr>
+          <w:ilvl w:val="0"/>
+          <w:numId w:val="2"/>
+        </w:numPr>
+        <w:spacing w:after="80"/>
+      </w:pPr>
+      <w:r>
+        <w:t xml:space="preserve">Select the customer. The Membership panel on the right shows their current status — "Active", "Expired", or "No Card" — along with the RFID code and expiry date when a card already exists.</w:t>
+      </w:r>
+    </w:p>
+    <w:p>
+      <w:pPr>
+        <w:pStyle w:val="ListParagraph"/>
+        <w:numPr>
+          <w:ilvl w:val="0"/>
+          <w:numId w:val="2"/>
+        </w:numPr>
+        <w:spacing w:after="80"/>
+      </w:pPr>
+      <w:r>
+        <w:t xml:space="preserve">Click "Activate Membership" if the customer has no card yet, or "Renew Membership" if they already have one.</w:t>
+      </w:r>
+    </w:p>
+    <w:p>
+      <w:pPr>
+        <w:pStyle w:val="ListParagraph"/>
+        <w:numPr>
+          <w:ilvl w:val="0"/>
+          <w:numId w:val="2"/>
+        </w:numPr>
+        <w:spacing w:after="80"/>
+      </w:pPr>
+      <w:r>
+        <w:t xml:space="preserve">For a new activation, scan or type the card number into "RFID Card Code". This is required — the payment cannot be confirmed without it. "Point Setting" is optional and can be left blank.</w:t>
+      </w:r>
+    </w:p>
+    <w:p>
+      <w:pPr>
+        <w:pStyle w:val="ListParagraph"/>
+        <w:numPr>
+          <w:ilvl w:val="0"/>
+          <w:numId w:val="2"/>
+        </w:numPr>
+        <w:spacing w:after="80"/>
+      </w:pPr>
+      <w:r>
+        <w:t xml:space="preserve">Check the fee and the "Valid Until" date shown in the dialog. The validity is counted from today, not from the old expiry date.</w:t>
+      </w:r>
+    </w:p>
+    <w:p>
+      <w:pPr>
+        <w:pStyle w:val="ListParagraph"/>
+        <w:numPr>
+          <w:ilvl w:val="0"/>
+          <w:numId w:val="2"/>
+        </w:numPr>
+        <w:spacing w:after="80"/>
+      </w:pPr>
+      <w:r>
+        <w:t xml:space="preserve">Choose "Cash" or "Card". For cash, enter the "Amount Tendered" and the change is worked out for you.</w:t>
+      </w:r>
+    </w:p>
+    <w:p>
+      <w:pPr>
+        <w:pStyle w:val="ListParagraph"/>
+        <w:numPr>
+          <w:ilvl w:val="0"/>
+          <w:numId w:val="2"/>
+        </w:numPr>
+        <w:spacing w:after="80"/>
+      </w:pPr>
+      <w:r>
+        <w:t xml:space="preserve">Click "Confirm Payment". A membership receipt prints automatically.</w:t>
+      </w:r>
+    </w:p>
+    <w:p>
+      <w:pPr>
+        <w:shd w:fill="F8D0D0" w:color="auto" w:val="clear"/>
+        <w:spacing w:after="120" w:before="120"/>
+      </w:pPr>
+      <w:r>
+        <w:t xml:space="preserve">[SCREENSHOT MISSING: pos-membership-payment]</w:t>
+      </w:r>
+    </w:p>
+    <w:tbl>
+      <w:tblPr>
+        <w:tblW w:type="pct" w:w="100%"/>
+        <w:tblBorders>
+          <w:top w:val="single" w:color="999999" w:sz="4"/>
+          <w:left w:val="single" w:color="999999" w:sz="4"/>
+          <w:bottom w:val="single" w:color="999999" w:sz="4"/>
+          <w:right w:val="single" w:color="999999" w:sz="4"/>
+          <w:insideH w:val="single" w:color="auto" w:sz="4"/>
+          <w:insideV w:val="single" w:color="auto" w:sz="4"/>
+        </w:tblBorders>
+      </w:tblPr>
+      <w:tblGrid>
+        <w:gridCol w:w="100"/>
+      </w:tblGrid>
+      <w:tr>
+        <w:tc>
+          <w:tcPr>
+            <w:shd w:fill="F8D0D0" w:color="auto" w:val="clear"/>
+            <w:tcMar>
+              <w:top w:type="dxa" w:w="100"/>
+              <w:left w:type="dxa" w:w="150"/>
+              <w:bottom w:type="dxa" w:w="100"/>
+              <w:right w:type="dxa" w:w="150"/>
+            </w:tcMar>
+          </w:tcPr>
+          <w:p>
+            <w:r>
+              <w:rPr>
+                <w:b/>
+                <w:bCs/>
+              </w:rPr>
+              <w:t xml:space="preserve">Warning: </w:t>
+            </w:r>
+            <w:r>
+              <w:t xml:space="preserve">A membership fee is not a sale. It is not rung up through the cart, it has no sales invoice (SI) number, and it will not appear in any of the sales reports. To see membership money collected, use Reports → Membership. The cash from membership fees is still real cash in your drawer, so it is counted as part of your expected cash when you end your shift.</w:t>
+            </w:r>
+          </w:p>
+        </w:tc>
+      </w:tr>
+    </w:tbl>
+    <w:p/>
+    <w:tbl>
+      <w:tblPr>
+        <w:tblW w:type="pct" w:w="100%"/>
+        <w:tblBorders>
+          <w:top w:val="single" w:color="999999" w:sz="4"/>
+          <w:left w:val="single" w:color="999999" w:sz="4"/>
+          <w:bottom w:val="single" w:color="999999" w:sz="4"/>
+          <w:right w:val="single" w:color="999999" w:sz="4"/>
+          <w:insideH w:val="single" w:color="auto" w:sz="4"/>
+          <w:insideV w:val="single" w:color="auto" w:sz="4"/>
+        </w:tblBorders>
+      </w:tblPr>
+      <w:tblGrid>
+        <w:gridCol w:w="100"/>
+      </w:tblGrid>
+      <w:tr>
+        <w:tc>
+          <w:tcPr>
+            <w:shd w:fill="FFF3C4" w:color="auto" w:val="clear"/>
+            <w:tcMar>
+              <w:top w:type="dxa" w:w="100"/>
+              <w:left w:type="dxa" w:w="150"/>
+              <w:bottom w:type="dxa" w:w="100"/>
+              <w:right w:type="dxa" w:w="150"/>
+            </w:tcMar>
+          </w:tcPr>
+          <w:p>
+            <w:r>
+              <w:rPr>
+                <w:b/>
+                <w:bCs/>
+              </w:rPr>
+              <w:t xml:space="preserve">Tip: </w:t>
+            </w:r>
+            <w:r>
+              <w:t xml:space="preserve">If the dialog shows the fee as ₱0.00 and will not let you confirm, the membership fee has not been set up yet. An admin needs to set it in Settings → POS Setup → General before any membership can be sold.</w:t>
+            </w:r>
+          </w:p>
+        </w:tc>
+      </w:tr>
+    </w:tbl>
+    <w:p/>
+    <w:p>
+      <w:pPr>
         <w:pStyle w:val="Heading1"/>
         <w:pageBreakBefore/>
       </w:pPr>
@@ -5600,7 +5825,7 @@
           </w:tcPr>
           <w:p>
             <w:r>
-              <w:t xml:space="preserve">Membership fee collections and loyalty program activity.</w:t>
+              <w:t xml:space="preserve">Membership activations and renewals, with amount, payment method, cashier, and how long each membership runs.</w:t>
             </w:r>
           </w:p>
         </w:tc>
@@ -5654,6 +5879,15 @@
       </w:tr>
     </w:tbl>
     <w:p/>
+    <w:p>
+      <w:pPr>
+        <w:shd w:fill="F8D0D0" w:color="auto" w:val="clear"/>
+        <w:spacing w:after="120" w:before="120"/>
+      </w:pPr>
+      <w:r>
+        <w:t xml:space="preserve">[SCREENSHOT MISSING: reports-membership]</w:t>
+      </w:r>
+    </w:p>
     <w:p>
       <w:pPr>
         <w:pStyle w:val="Heading1"/>
@@ -5870,6 +6104,117 @@
         <w:t xml:space="preserve">Figure 32: POS setup</w:t>
       </w:r>
     </w:p>
+    <w:p>
+      <w:pPr>
+        <w:spacing w:after="160"/>
+      </w:pPr>
+      <w:r>
+        <w:t xml:space="preserve">The General tab also holds the Membership settings, which control what customers pay for a loyalty card and how long that card stays valid. Cashiers cannot collect a membership fee until these are set.</w:t>
+      </w:r>
+    </w:p>
+    <w:p>
+      <w:pPr>
+        <w:pStyle w:val="ListParagraph"/>
+        <w:numPr>
+          <w:ilvl w:val="0"/>
+          <w:numId w:val="2"/>
+        </w:numPr>
+        <w:spacing w:after="80"/>
+      </w:pPr>
+      <w:r>
+        <w:t xml:space="preserve">Go to Settings → POS Setup and open the "General" tab.</w:t>
+      </w:r>
+    </w:p>
+    <w:p>
+      <w:pPr>
+        <w:pStyle w:val="ListParagraph"/>
+        <w:numPr>
+          <w:ilvl w:val="0"/>
+          <w:numId w:val="2"/>
+        </w:numPr>
+        <w:spacing w:after="80"/>
+      </w:pPr>
+      <w:r>
+        <w:t xml:space="preserve">Set "Membership Fee (₱)" — the amount charged to activate or renew a customer's loyalty card.</w:t>
+      </w:r>
+    </w:p>
+    <w:p>
+      <w:pPr>
+        <w:pStyle w:val="ListParagraph"/>
+        <w:numPr>
+          <w:ilvl w:val="0"/>
+          <w:numId w:val="2"/>
+        </w:numPr>
+        <w:spacing w:after="80"/>
+      </w:pPr>
+      <w:r>
+        <w:t xml:space="preserve">Set "Membership Duration (months)" — how long a paid membership lasts, counted from the day it is paid. The default is 12 months.</w:t>
+      </w:r>
+    </w:p>
+    <w:p>
+      <w:pPr>
+        <w:pStyle w:val="ListParagraph"/>
+        <w:numPr>
+          <w:ilvl w:val="0"/>
+          <w:numId w:val="2"/>
+        </w:numPr>
+        <w:spacing w:after="80"/>
+      </w:pPr>
+      <w:r>
+        <w:t xml:space="preserve">Click "Save Settings" at the top of the page.</w:t>
+      </w:r>
+    </w:p>
+    <w:p>
+      <w:pPr>
+        <w:shd w:fill="F8D0D0" w:color="auto" w:val="clear"/>
+        <w:spacing w:after="120" w:before="120"/>
+      </w:pPr>
+      <w:r>
+        <w:t xml:space="preserve">[SCREENSHOT MISSING: settings-membership]</w:t>
+      </w:r>
+    </w:p>
+    <w:tbl>
+      <w:tblPr>
+        <w:tblW w:type="pct" w:w="100%"/>
+        <w:tblBorders>
+          <w:top w:val="single" w:color="999999" w:sz="4"/>
+          <w:left w:val="single" w:color="999999" w:sz="4"/>
+          <w:bottom w:val="single" w:color="999999" w:sz="4"/>
+          <w:right w:val="single" w:color="999999" w:sz="4"/>
+          <w:insideH w:val="single" w:color="auto" w:sz="4"/>
+          <w:insideV w:val="single" w:color="auto" w:sz="4"/>
+        </w:tblBorders>
+      </w:tblPr>
+      <w:tblGrid>
+        <w:gridCol w:w="100"/>
+      </w:tblGrid>
+      <w:tr>
+        <w:tc>
+          <w:tcPr>
+            <w:shd w:fill="FFF3C4" w:color="auto" w:val="clear"/>
+            <w:tcMar>
+              <w:top w:type="dxa" w:w="100"/>
+              <w:left w:type="dxa" w:w="150"/>
+              <w:bottom w:type="dxa" w:w="100"/>
+              <w:right w:type="dxa" w:w="150"/>
+            </w:tcMar>
+          </w:tcPr>
+          <w:p>
+            <w:r>
+              <w:rPr>
+                <w:b/>
+                <w:bCs/>
+              </w:rPr>
+              <w:t xml:space="preserve">Tip: </w:t>
+            </w:r>
+            <w:r>
+              <w:t xml:space="preserve">Leaving the membership fee at ₱0.00 stops cashiers from selling memberships altogether — the payment dialog at the POS refuses to confirm and points back to this tab. Set a real amount before the store starts offering memberships.</w:t>
+            </w:r>
+          </w:p>
+        </w:tc>
+      </w:tr>
+    </w:tbl>
+    <w:p/>
     <w:p>
       <w:pPr>
         <w:pStyle w:val="Heading2"/>

</xml_diff>

<commit_message>
fix(pos): scope X-Reading report to the current shift, reuse the real receipt layout
/pos/x-reading picked "whichever shift started most recently, system-wide"
instead of the operator's own shift, so it could silently show a different
(often empty) shift's zero totals whenever more than one shift was active
at once. It also rendered a bespoke card layout that had drifted from the
actual thermal-receipt report cashiers see everywhere else in the POS.

Scope the fetch by the session's own shiftId (mirroring the in-POS X-Reading
dialog), and reuse the shared XReadingPreview receipt component instead of
the standalone page's own drifted copy — same pattern ZReadingReportView
already uses. Recaptured the manual's X/Z-Reading screenshots and rebuilt
the docx to match.
</commit_message>
<xml_diff>
--- a/docs/manual/VerdixPOS-User-Manual.docx
+++ b/docs/manual/VerdixPOS-User-Manual.docx
@@ -41,7 +41,7 @@
           <w:sz w:val="22"/>
           <w:szCs w:val="22"/>
         </w:rPr>
-        <w:t xml:space="preserve">Generated July 28, 2026</w:t>
+        <w:t xml:space="preserve">Generated August 3, 2026</w:t>
       </w:r>
     </w:p>
     <w:p>
@@ -4029,185 +4029,6 @@
     </w:p>
     <w:p>
       <w:pPr>
-        <w:shd w:fill="F8D0D0" w:color="auto" w:val="clear"/>
-        <w:spacing w:after="120" w:before="120"/>
-      </w:pPr>
-      <w:r>
-        <w:t xml:space="preserve">[SCREENSHOT MISSING: pos-membership-payment]</w:t>
-      </w:r>
-    </w:p>
-    <w:tbl>
-      <w:tblPr>
-        <w:tblW w:type="pct" w:w="100%"/>
-        <w:tblBorders>
-          <w:top w:val="single" w:color="999999" w:sz="4"/>
-          <w:left w:val="single" w:color="999999" w:sz="4"/>
-          <w:bottom w:val="single" w:color="999999" w:sz="4"/>
-          <w:right w:val="single" w:color="999999" w:sz="4"/>
-          <w:insideH w:val="single" w:color="auto" w:sz="4"/>
-          <w:insideV w:val="single" w:color="auto" w:sz="4"/>
-        </w:tblBorders>
-      </w:tblPr>
-      <w:tblGrid>
-        <w:gridCol w:w="100"/>
-      </w:tblGrid>
-      <w:tr>
-        <w:tc>
-          <w:tcPr>
-            <w:shd w:fill="F8D0D0" w:color="auto" w:val="clear"/>
-            <w:tcMar>
-              <w:top w:type="dxa" w:w="100"/>
-              <w:left w:type="dxa" w:w="150"/>
-              <w:bottom w:type="dxa" w:w="100"/>
-              <w:right w:type="dxa" w:w="150"/>
-            </w:tcMar>
-          </w:tcPr>
-          <w:p>
-            <w:r>
-              <w:rPr>
-                <w:b/>
-                <w:bCs/>
-              </w:rPr>
-              <w:t xml:space="preserve">Warning: </w:t>
-            </w:r>
-            <w:r>
-              <w:t xml:space="preserve">A membership fee is not a sale. It is not rung up through the cart, it has no sales invoice (SI) number, and it will not appear in any of the sales reports. To see membership money collected, use Reports → Membership. The cash from membership fees is still real cash in your drawer, so it is counted as part of your expected cash when you end your shift.</w:t>
-            </w:r>
-          </w:p>
-        </w:tc>
-      </w:tr>
-    </w:tbl>
-    <w:p/>
-    <w:tbl>
-      <w:tblPr>
-        <w:tblW w:type="pct" w:w="100%"/>
-        <w:tblBorders>
-          <w:top w:val="single" w:color="999999" w:sz="4"/>
-          <w:left w:val="single" w:color="999999" w:sz="4"/>
-          <w:bottom w:val="single" w:color="999999" w:sz="4"/>
-          <w:right w:val="single" w:color="999999" w:sz="4"/>
-          <w:insideH w:val="single" w:color="auto" w:sz="4"/>
-          <w:insideV w:val="single" w:color="auto" w:sz="4"/>
-        </w:tblBorders>
-      </w:tblPr>
-      <w:tblGrid>
-        <w:gridCol w:w="100"/>
-      </w:tblGrid>
-      <w:tr>
-        <w:tc>
-          <w:tcPr>
-            <w:shd w:fill="FFF3C4" w:color="auto" w:val="clear"/>
-            <w:tcMar>
-              <w:top w:type="dxa" w:w="100"/>
-              <w:left w:type="dxa" w:w="150"/>
-              <w:bottom w:type="dxa" w:w="100"/>
-              <w:right w:type="dxa" w:w="150"/>
-            </w:tcMar>
-          </w:tcPr>
-          <w:p>
-            <w:r>
-              <w:rPr>
-                <w:b/>
-                <w:bCs/>
-              </w:rPr>
-              <w:t xml:space="preserve">Tip: </w:t>
-            </w:r>
-            <w:r>
-              <w:t xml:space="preserve">If the dialog shows the fee as ₱0.00 and will not let you confirm, the membership fee has not been set up yet. An admin needs to set it in Settings → POS Setup → General before any membership can be sold.</w:t>
-            </w:r>
-          </w:p>
-        </w:tc>
-      </w:tr>
-    </w:tbl>
-    <w:p/>
-    <w:p>
-      <w:pPr>
-        <w:pStyle w:val="Heading1"/>
-        <w:pageBreakBefore/>
-      </w:pPr>
-      <w:r>
-        <w:t xml:space="preserve">Chapter 7: Approvals</w:t>
-      </w:r>
-    </w:p>
-    <w:p>
-      <w:pPr>
-        <w:spacing w:after="200"/>
-      </w:pPr>
-      <w:r>
-        <w:t xml:space="preserve">Certain changes in Verdix — purchase orders, stock counts, stock transfers, bad orders, and bulk adjustments — do not take effect immediately. They go through an approvals queue first, so a second person can review and confirm the change before it becomes final.</w:t>
-      </w:r>
-    </w:p>
-    <w:p>
-      <w:pPr>
-        <w:pStyle w:val="Heading2"/>
-        <w:spacing w:before="200"/>
-      </w:pPr>
-      <w:r>
-        <w:t xml:space="preserve">Working the Approvals board</w:t>
-      </w:r>
-    </w:p>
-    <w:p>
-      <w:pPr>
-        <w:spacing w:after="160"/>
-      </w:pPr>
-      <w:r>
-        <w:t xml:space="preserve">The Approvals page shows every pending request as a card, filterable by type: All, Adjust, POs, Transfers, Receive, Bad Order, Counts, Repack, Shelf, or Add Product. Each card shows what is being requested, who requested it, and what step of the approval workflow it is currently on.</w:t>
-      </w:r>
-    </w:p>
-    <w:p>
-      <w:pPr>
-        <w:pStyle w:val="ListParagraph"/>
-        <w:numPr>
-          <w:ilvl w:val="0"/>
-          <w:numId w:val="2"/>
-        </w:numPr>
-        <w:spacing w:after="80"/>
-      </w:pPr>
-      <w:r>
-        <w:t xml:space="preserve">Go to Approvals.</w:t>
-      </w:r>
-    </w:p>
-    <w:p>
-      <w:pPr>
-        <w:pStyle w:val="ListParagraph"/>
-        <w:numPr>
-          <w:ilvl w:val="0"/>
-          <w:numId w:val="2"/>
-        </w:numPr>
-        <w:spacing w:after="80"/>
-      </w:pPr>
-      <w:r>
-        <w:t xml:space="preserve">Use the type filter buttons to narrow the list to the kind of request you are reviewing.</w:t>
-      </w:r>
-    </w:p>
-    <w:p>
-      <w:pPr>
-        <w:pStyle w:val="ListParagraph"/>
-        <w:numPr>
-          <w:ilvl w:val="0"/>
-          <w:numId w:val="2"/>
-        </w:numPr>
-        <w:spacing w:after="80"/>
-      </w:pPr>
-      <w:r>
-        <w:t xml:space="preserve">Click a card to open its details and see the full history of who has approved or rejected it so far.</w:t>
-      </w:r>
-    </w:p>
-    <w:p>
-      <w:pPr>
-        <w:pStyle w:val="ListParagraph"/>
-        <w:numPr>
-          <w:ilvl w:val="0"/>
-          <w:numId w:val="2"/>
-        </w:numPr>
-        <w:spacing w:after="80"/>
-      </w:pPr>
-      <w:r>
-        <w:t xml:space="preserve">Approve or reject the request from the detail view. Rejected requests do not change stock or accounts; approved requests move to the next approval level, or are finalized if this was the last required level.</w:t>
-      </w:r>
-    </w:p>
-    <w:p>
-      <w:pPr>
         <w:spacing w:after="40" w:before="120"/>
         <w:jc w:val="center"/>
       </w:pPr>
@@ -4262,15 +4083,108 @@
           <w:i/>
           <w:iCs/>
         </w:rPr>
-        <w:t xml:space="preserve">Figure 26: Approvals board</w:t>
-      </w:r>
-    </w:p>
-    <w:p>
-      <w:pPr>
-        <w:spacing w:after="160"/>
-      </w:pPr>
-      <w:r>
-        <w:t xml:space="preserve">A request only affects real stock or account balances once it has passed every required approval level and is finalized. Until then it sits as "pending" and has no effect on the numbers shown elsewhere in the system.</w:t>
+        <w:t xml:space="preserve">Figure 26: Membership payment</w:t>
+      </w:r>
+    </w:p>
+    <w:tbl>
+      <w:tblPr>
+        <w:tblW w:type="pct" w:w="100%"/>
+        <w:tblBorders>
+          <w:top w:val="single" w:color="999999" w:sz="4"/>
+          <w:left w:val="single" w:color="999999" w:sz="4"/>
+          <w:bottom w:val="single" w:color="999999" w:sz="4"/>
+          <w:right w:val="single" w:color="999999" w:sz="4"/>
+          <w:insideH w:val="single" w:color="auto" w:sz="4"/>
+          <w:insideV w:val="single" w:color="auto" w:sz="4"/>
+        </w:tblBorders>
+      </w:tblPr>
+      <w:tblGrid>
+        <w:gridCol w:w="100"/>
+      </w:tblGrid>
+      <w:tr>
+        <w:tc>
+          <w:tcPr>
+            <w:shd w:fill="F8D0D0" w:color="auto" w:val="clear"/>
+            <w:tcMar>
+              <w:top w:type="dxa" w:w="100"/>
+              <w:left w:type="dxa" w:w="150"/>
+              <w:bottom w:type="dxa" w:w="100"/>
+              <w:right w:type="dxa" w:w="150"/>
+            </w:tcMar>
+          </w:tcPr>
+          <w:p>
+            <w:r>
+              <w:rPr>
+                <w:b/>
+                <w:bCs/>
+              </w:rPr>
+              <w:t xml:space="preserve">Warning: </w:t>
+            </w:r>
+            <w:r>
+              <w:t xml:space="preserve">A membership fee is not a sale. It is not rung up through the cart, it has no sales invoice (SI) number, and it will not appear in any of the sales reports. To see membership money collected, use Reports → Membership. The cash from membership fees is still real cash in your drawer, so it is counted as part of your expected cash when you end your shift.</w:t>
+            </w:r>
+          </w:p>
+        </w:tc>
+      </w:tr>
+    </w:tbl>
+    <w:p/>
+    <w:tbl>
+      <w:tblPr>
+        <w:tblW w:type="pct" w:w="100%"/>
+        <w:tblBorders>
+          <w:top w:val="single" w:color="999999" w:sz="4"/>
+          <w:left w:val="single" w:color="999999" w:sz="4"/>
+          <w:bottom w:val="single" w:color="999999" w:sz="4"/>
+          <w:right w:val="single" w:color="999999" w:sz="4"/>
+          <w:insideH w:val="single" w:color="auto" w:sz="4"/>
+          <w:insideV w:val="single" w:color="auto" w:sz="4"/>
+        </w:tblBorders>
+      </w:tblPr>
+      <w:tblGrid>
+        <w:gridCol w:w="100"/>
+      </w:tblGrid>
+      <w:tr>
+        <w:tc>
+          <w:tcPr>
+            <w:shd w:fill="FFF3C4" w:color="auto" w:val="clear"/>
+            <w:tcMar>
+              <w:top w:type="dxa" w:w="100"/>
+              <w:left w:type="dxa" w:w="150"/>
+              <w:bottom w:type="dxa" w:w="100"/>
+              <w:right w:type="dxa" w:w="150"/>
+            </w:tcMar>
+          </w:tcPr>
+          <w:p>
+            <w:r>
+              <w:rPr>
+                <w:b/>
+                <w:bCs/>
+              </w:rPr>
+              <w:t xml:space="preserve">Tip: </w:t>
+            </w:r>
+            <w:r>
+              <w:t xml:space="preserve">If the dialog shows the fee as ₱0.00 and will not let you confirm, the membership fee has not been set up yet. An admin needs to set it in Settings → POS Setup → General before any membership can be sold.</w:t>
+            </w:r>
+          </w:p>
+        </w:tc>
+      </w:tr>
+    </w:tbl>
+    <w:p/>
+    <w:p>
+      <w:pPr>
+        <w:pStyle w:val="Heading1"/>
+        <w:pageBreakBefore/>
+      </w:pPr>
+      <w:r>
+        <w:t xml:space="preserve">Chapter 7: Approvals</w:t>
+      </w:r>
+    </w:p>
+    <w:p>
+      <w:pPr>
+        <w:spacing w:after="200"/>
+      </w:pPr>
+      <w:r>
+        <w:t xml:space="preserve">Certain changes in Verdix — purchase orders, stock counts, stock transfers, bad orders, and bulk adjustments — do not take effect immediately. They go through an approvals queue first, so a second person can review and confirm the change before it becomes final.</w:t>
       </w:r>
     </w:p>
     <w:p>
@@ -4279,67 +4193,67 @@
         <w:spacing w:before="200"/>
       </w:pPr>
       <w:r>
-        <w:t xml:space="preserve">Configuring approval workflows</w:t>
-      </w:r>
-    </w:p>
-    <w:p>
-      <w:pPr>
-        <w:spacing w:after="160"/>
-      </w:pPr>
-      <w:r>
-        <w:t xml:space="preserve">The Workflow Settings page controls which transaction types require approval, how many levels of approval each one needs, and which roles are allowed to approve at each level. This is a setup task done once by an admin, not a day-to-day cashier task.</w:t>
-      </w:r>
-    </w:p>
-    <w:p>
-      <w:pPr>
-        <w:pStyle w:val="ListParagraph"/>
-        <w:numPr>
-          <w:ilvl w:val="0"/>
-          <w:numId w:val="2"/>
-        </w:numPr>
-        <w:spacing w:after="80"/>
-      </w:pPr>
-      <w:r>
-        <w:t xml:space="preserve">Go to Approvals → Workflow Settings.</w:t>
-      </w:r>
-    </w:p>
-    <w:p>
-      <w:pPr>
-        <w:pStyle w:val="ListParagraph"/>
-        <w:numPr>
-          <w:ilvl w:val="0"/>
-          <w:numId w:val="2"/>
-        </w:numPr>
-        <w:spacing w:after="80"/>
-      </w:pPr>
-      <w:r>
-        <w:t xml:space="preserve">Choose the transaction type you want to configure (for example Stock Adjustment or Purchase Order).</w:t>
-      </w:r>
-    </w:p>
-    <w:p>
-      <w:pPr>
-        <w:pStyle w:val="ListParagraph"/>
-        <w:numPr>
-          <w:ilvl w:val="0"/>
-          <w:numId w:val="2"/>
-        </w:numPr>
-        <w:spacing w:after="80"/>
-      </w:pPr>
-      <w:r>
-        <w:t xml:space="preserve">Set how many approval levels are required and which role is responsible for each level.</w:t>
-      </w:r>
-    </w:p>
-    <w:p>
-      <w:pPr>
-        <w:pStyle w:val="ListParagraph"/>
-        <w:numPr>
-          <w:ilvl w:val="0"/>
-          <w:numId w:val="2"/>
-        </w:numPr>
-        <w:spacing w:after="80"/>
-      </w:pPr>
-      <w:r>
-        <w:t xml:space="preserve">Save your changes. New requests of this type will now follow the updated workflow; requests already pending keep the workflow that was active when they were created.</w:t>
+        <w:t xml:space="preserve">Working the Approvals board</w:t>
+      </w:r>
+    </w:p>
+    <w:p>
+      <w:pPr>
+        <w:spacing w:after="160"/>
+      </w:pPr>
+      <w:r>
+        <w:t xml:space="preserve">The Approvals page shows every pending request as a card, filterable by type: All, Adjust, POs, Transfers, Receive, Bad Order, Counts, Repack, Shelf, or Add Product. Each card shows what is being requested, who requested it, and what step of the approval workflow it is currently on.</w:t>
+      </w:r>
+    </w:p>
+    <w:p>
+      <w:pPr>
+        <w:pStyle w:val="ListParagraph"/>
+        <w:numPr>
+          <w:ilvl w:val="0"/>
+          <w:numId w:val="2"/>
+        </w:numPr>
+        <w:spacing w:after="80"/>
+      </w:pPr>
+      <w:r>
+        <w:t xml:space="preserve">Go to Approvals.</w:t>
+      </w:r>
+    </w:p>
+    <w:p>
+      <w:pPr>
+        <w:pStyle w:val="ListParagraph"/>
+        <w:numPr>
+          <w:ilvl w:val="0"/>
+          <w:numId w:val="2"/>
+        </w:numPr>
+        <w:spacing w:after="80"/>
+      </w:pPr>
+      <w:r>
+        <w:t xml:space="preserve">Use the type filter buttons to narrow the list to the kind of request you are reviewing.</w:t>
+      </w:r>
+    </w:p>
+    <w:p>
+      <w:pPr>
+        <w:pStyle w:val="ListParagraph"/>
+        <w:numPr>
+          <w:ilvl w:val="0"/>
+          <w:numId w:val="2"/>
+        </w:numPr>
+        <w:spacing w:after="80"/>
+      </w:pPr>
+      <w:r>
+        <w:t xml:space="preserve">Click a card to open its details and see the full history of who has approved or rejected it so far.</w:t>
+      </w:r>
+    </w:p>
+    <w:p>
+      <w:pPr>
+        <w:pStyle w:val="ListParagraph"/>
+        <w:numPr>
+          <w:ilvl w:val="0"/>
+          <w:numId w:val="2"/>
+        </w:numPr>
+        <w:spacing w:after="80"/>
+      </w:pPr>
+      <w:r>
+        <w:t xml:space="preserve">Approve or reject the request from the detail view. Rejected requests do not change stock or accounts; approved requests move to the next approval level, or are finalized if this was the last required level.</w:t>
       </w:r>
     </w:p>
     <w:p>
@@ -4398,24 +4312,15 @@
           <w:i/>
           <w:iCs/>
         </w:rPr>
-        <w:t xml:space="preserve">Figure 27: Workflow settings</w:t>
-      </w:r>
-    </w:p>
-    <w:p>
-      <w:pPr>
-        <w:pStyle w:val="Heading1"/>
-        <w:pageBreakBefore/>
-      </w:pPr>
-      <w:r>
-        <w:t xml:space="preserve">Chapter 8: Reports</w:t>
-      </w:r>
-    </w:p>
-    <w:p>
-      <w:pPr>
-        <w:spacing w:after="200"/>
-      </w:pPr>
-      <w:r>
-        <w:t xml:space="preserve">Verdix includes a large library of reports covering sales, inventory, purchases, and compliance. Rather than walking through each one individually, this chapter shows you how to get to the Reports hub and gives you an index of every available report and what it is for.</w:t>
+        <w:t xml:space="preserve">Figure 27: Approvals board</w:t>
+      </w:r>
+    </w:p>
+    <w:p>
+      <w:pPr>
+        <w:spacing w:after="160"/>
+      </w:pPr>
+      <w:r>
+        <w:t xml:space="preserve">A request only affects real stock or account balances once it has passed every required approval level and is finalized. Until then it sits as "pending" and has no effect on the numbers shown elsewhere in the system.</w:t>
       </w:r>
     </w:p>
     <w:p>
@@ -4424,67 +4329,67 @@
         <w:spacing w:before="200"/>
       </w:pPr>
       <w:r>
-        <w:t xml:space="preserve">The Reports hub</w:t>
-      </w:r>
-    </w:p>
-    <w:p>
-      <w:pPr>
-        <w:spacing w:after="160"/>
-      </w:pPr>
-      <w:r>
-        <w:t xml:space="preserve">All reports are reached from a single hub page, organized into categories such as Sales, Purchases, Inventory, and Compliance. Click any report tile to open it, then use its own filters (usually a date range and sometimes a product, customer, or supplier filter) to narrow the results.</w:t>
-      </w:r>
-    </w:p>
-    <w:p>
-      <w:pPr>
-        <w:pStyle w:val="ListParagraph"/>
-        <w:numPr>
-          <w:ilvl w:val="0"/>
-          <w:numId w:val="2"/>
-        </w:numPr>
-        <w:spacing w:after="80"/>
-      </w:pPr>
-      <w:r>
-        <w:t xml:space="preserve">Go to Reports from the sidebar.</w:t>
-      </w:r>
-    </w:p>
-    <w:p>
-      <w:pPr>
-        <w:pStyle w:val="ListParagraph"/>
-        <w:numPr>
-          <w:ilvl w:val="0"/>
-          <w:numId w:val="2"/>
-        </w:numPr>
-        <w:spacing w:after="80"/>
-      </w:pPr>
-      <w:r>
-        <w:t xml:space="preserve">Click the report you need from the hub.</w:t>
-      </w:r>
-    </w:p>
-    <w:p>
-      <w:pPr>
-        <w:pStyle w:val="ListParagraph"/>
-        <w:numPr>
-          <w:ilvl w:val="0"/>
-          <w:numId w:val="2"/>
-        </w:numPr>
-        <w:spacing w:after="80"/>
-      </w:pPr>
-      <w:r>
-        <w:t xml:space="preserve">Set the date range or other filters at the top of the report.</w:t>
-      </w:r>
-    </w:p>
-    <w:p>
-      <w:pPr>
-        <w:pStyle w:val="ListParagraph"/>
-        <w:numPr>
-          <w:ilvl w:val="0"/>
-          <w:numId w:val="2"/>
-        </w:numPr>
-        <w:spacing w:after="80"/>
-      </w:pPr>
-      <w:r>
-        <w:t xml:space="preserve">Most reports offer an export or print option once the data is loaded.</w:t>
+        <w:t xml:space="preserve">Configuring approval workflows</w:t>
+      </w:r>
+    </w:p>
+    <w:p>
+      <w:pPr>
+        <w:spacing w:after="160"/>
+      </w:pPr>
+      <w:r>
+        <w:t xml:space="preserve">The Workflow Settings page controls which transaction types require approval, how many levels of approval each one needs, and which roles are allowed to approve at each level. This is a setup task done once by an admin, not a day-to-day cashier task.</w:t>
+      </w:r>
+    </w:p>
+    <w:p>
+      <w:pPr>
+        <w:pStyle w:val="ListParagraph"/>
+        <w:numPr>
+          <w:ilvl w:val="0"/>
+          <w:numId w:val="2"/>
+        </w:numPr>
+        <w:spacing w:after="80"/>
+      </w:pPr>
+      <w:r>
+        <w:t xml:space="preserve">Go to Approvals → Workflow Settings.</w:t>
+      </w:r>
+    </w:p>
+    <w:p>
+      <w:pPr>
+        <w:pStyle w:val="ListParagraph"/>
+        <w:numPr>
+          <w:ilvl w:val="0"/>
+          <w:numId w:val="2"/>
+        </w:numPr>
+        <w:spacing w:after="80"/>
+      </w:pPr>
+      <w:r>
+        <w:t xml:space="preserve">Choose the transaction type you want to configure (for example Stock Adjustment or Purchase Order).</w:t>
+      </w:r>
+    </w:p>
+    <w:p>
+      <w:pPr>
+        <w:pStyle w:val="ListParagraph"/>
+        <w:numPr>
+          <w:ilvl w:val="0"/>
+          <w:numId w:val="2"/>
+        </w:numPr>
+        <w:spacing w:after="80"/>
+      </w:pPr>
+      <w:r>
+        <w:t xml:space="preserve">Set how many approval levels are required and which role is responsible for each level.</w:t>
+      </w:r>
+    </w:p>
+    <w:p>
+      <w:pPr>
+        <w:pStyle w:val="ListParagraph"/>
+        <w:numPr>
+          <w:ilvl w:val="0"/>
+          <w:numId w:val="2"/>
+        </w:numPr>
+        <w:spacing w:after="80"/>
+      </w:pPr>
+      <w:r>
+        <w:t xml:space="preserve">Save your changes. New requests of this type will now follow the updated workflow; requests already pending keep the workflow that was active when they were created.</w:t>
       </w:r>
     </w:p>
     <w:p>
@@ -4543,7 +4448,24 @@
           <w:i/>
           <w:iCs/>
         </w:rPr>
-        <w:t xml:space="preserve">Figure 28: The reports hub</w:t>
+        <w:t xml:space="preserve">Figure 28: Workflow settings</w:t>
+      </w:r>
+    </w:p>
+    <w:p>
+      <w:pPr>
+        <w:pStyle w:val="Heading1"/>
+        <w:pageBreakBefore/>
+      </w:pPr>
+      <w:r>
+        <w:t xml:space="preserve">Chapter 8: Reports</w:t>
+      </w:r>
+    </w:p>
+    <w:p>
+      <w:pPr>
+        <w:spacing w:after="200"/>
+      </w:pPr>
+      <w:r>
+        <w:t xml:space="preserve">Verdix includes a large library of reports covering sales, inventory, purchases, and compliance. Rather than walking through each one individually, this chapter shows you how to get to the Reports hub and gives you an index of every available report and what it is for.</w:t>
       </w:r>
     </w:p>
     <w:p>
@@ -4552,15 +4474,67 @@
         <w:spacing w:before="200"/>
       </w:pPr>
       <w:r>
-        <w:t xml:space="preserve">Two commonly used reports</w:t>
-      </w:r>
-    </w:p>
-    <w:p>
-      <w:pPr>
-        <w:spacing w:after="160"/>
-      </w:pPr>
-      <w:r>
-        <w:t xml:space="preserve">The two reports below are used often enough that most stores check them daily. Both are also listed in the full index at the end of this chapter.</w:t>
+        <w:t xml:space="preserve">The Reports hub</w:t>
+      </w:r>
+    </w:p>
+    <w:p>
+      <w:pPr>
+        <w:spacing w:after="160"/>
+      </w:pPr>
+      <w:r>
+        <w:t xml:space="preserve">All reports are reached from a single hub page, organized into categories such as Sales, Purchases, Inventory, and Compliance. Click any report tile to open it, then use its own filters (usually a date range and sometimes a product, customer, or supplier filter) to narrow the results.</w:t>
+      </w:r>
+    </w:p>
+    <w:p>
+      <w:pPr>
+        <w:pStyle w:val="ListParagraph"/>
+        <w:numPr>
+          <w:ilvl w:val="0"/>
+          <w:numId w:val="2"/>
+        </w:numPr>
+        <w:spacing w:after="80"/>
+      </w:pPr>
+      <w:r>
+        <w:t xml:space="preserve">Go to Reports from the sidebar.</w:t>
+      </w:r>
+    </w:p>
+    <w:p>
+      <w:pPr>
+        <w:pStyle w:val="ListParagraph"/>
+        <w:numPr>
+          <w:ilvl w:val="0"/>
+          <w:numId w:val="2"/>
+        </w:numPr>
+        <w:spacing w:after="80"/>
+      </w:pPr>
+      <w:r>
+        <w:t xml:space="preserve">Click the report you need from the hub.</w:t>
+      </w:r>
+    </w:p>
+    <w:p>
+      <w:pPr>
+        <w:pStyle w:val="ListParagraph"/>
+        <w:numPr>
+          <w:ilvl w:val="0"/>
+          <w:numId w:val="2"/>
+        </w:numPr>
+        <w:spacing w:after="80"/>
+      </w:pPr>
+      <w:r>
+        <w:t xml:space="preserve">Set the date range or other filters at the top of the report.</w:t>
+      </w:r>
+    </w:p>
+    <w:p>
+      <w:pPr>
+        <w:pStyle w:val="ListParagraph"/>
+        <w:numPr>
+          <w:ilvl w:val="0"/>
+          <w:numId w:val="2"/>
+        </w:numPr>
+        <w:spacing w:after="80"/>
+      </w:pPr>
+      <w:r>
+        <w:t xml:space="preserve">Most reports offer an export or print option once the data is loaded.</w:t>
       </w:r>
     </w:p>
     <w:p>
@@ -4619,15 +4593,24 @@
           <w:i/>
           <w:iCs/>
         </w:rPr>
-        <w:t xml:space="preserve">Figure 29: Sales summary report</w:t>
-      </w:r>
-    </w:p>
-    <w:p>
-      <w:pPr>
-        <w:spacing w:after="160"/>
-      </w:pPr>
-      <w:r>
-        <w:t xml:space="preserve">Sales Summary gives a top-level view of a day's or period's total sales, useful for a quick daily check against your cash drawer count.</w:t>
+        <w:t xml:space="preserve">Figure 29: The reports hub</w:t>
+      </w:r>
+    </w:p>
+    <w:p>
+      <w:pPr>
+        <w:pStyle w:val="Heading2"/>
+        <w:spacing w:before="200"/>
+      </w:pPr>
+      <w:r>
+        <w:t xml:space="preserve">Two commonly used reports</w:t>
+      </w:r>
+    </w:p>
+    <w:p>
+      <w:pPr>
+        <w:spacing w:after="160"/>
+      </w:pPr>
+      <w:r>
+        <w:t xml:space="preserve">The two reports below are used often enough that most stores check them daily. Both are also listed in the full index at the end of this chapter.</w:t>
       </w:r>
     </w:p>
     <w:p>
@@ -4686,1240 +4669,15 @@
           <w:i/>
           <w:iCs/>
         </w:rPr>
-        <w:t xml:space="preserve">Figure 30: Low stock report</w:t>
-      </w:r>
-    </w:p>
-    <w:p>
-      <w:pPr>
-        <w:spacing w:after="160"/>
-      </w:pPr>
-      <w:r>
-        <w:t xml:space="preserve">Low Stock lists every product that has fallen below its reorder point — check this before creating purchase orders so nothing is missed.</w:t>
-      </w:r>
-    </w:p>
-    <w:p>
-      <w:pPr>
-        <w:pStyle w:val="Heading2"/>
-        <w:spacing w:before="200"/>
-      </w:pPr>
-      <w:r>
-        <w:t xml:space="preserve">Full report index</w:t>
-      </w:r>
-    </w:p>
-    <w:p>
-      <w:pPr>
-        <w:spacing w:after="160"/>
-      </w:pPr>
-      <w:r>
-        <w:t xml:space="preserve">The table below lists every report available in Verdix POS, with the menu path and a one-line description of what it shows.</w:t>
-      </w:r>
-    </w:p>
-    <w:tbl>
-      <w:tblPr>
-        <w:tblW w:type="pct" w:w="100%"/>
-        <w:tblBorders>
-          <w:top w:val="single" w:color="888888" w:sz="2"/>
-          <w:left w:val="single" w:color="888888" w:sz="2"/>
-          <w:bottom w:val="single" w:color="888888" w:sz="2"/>
-          <w:right w:val="single" w:color="888888" w:sz="2"/>
-          <w:insideH w:val="single" w:color="888888" w:sz="2"/>
-          <w:insideV w:val="single" w:color="888888" w:sz="2"/>
-        </w:tblBorders>
-      </w:tblPr>
-      <w:tblGrid>
-        <w:gridCol w:w="100"/>
-        <w:gridCol w:w="100"/>
-        <w:gridCol w:w="100"/>
-      </w:tblGrid>
-      <w:tr>
-        <w:trPr>
-          <w:tblHeader/>
-        </w:trPr>
-        <w:tc>
-          <w:tcPr>
-            <w:shd w:fill="DDDDDD" w:color="auto" w:val="clear"/>
-            <w:tcMar>
-              <w:top w:type="dxa" w:w="80"/>
-              <w:left w:type="dxa" w:w="100"/>
-              <w:bottom w:type="dxa" w:w="80"/>
-              <w:right w:type="dxa" w:w="100"/>
-            </w:tcMar>
-          </w:tcPr>
-          <w:p>
-            <w:r>
-              <w:rPr>
-                <w:b/>
-                <w:bCs/>
-              </w:rPr>
-              <w:t xml:space="preserve">Report</w:t>
-            </w:r>
-          </w:p>
-        </w:tc>
-        <w:tc>
-          <w:tcPr>
-            <w:shd w:fill="DDDDDD" w:color="auto" w:val="clear"/>
-            <w:tcMar>
-              <w:top w:type="dxa" w:w="80"/>
-              <w:left w:type="dxa" w:w="100"/>
-              <w:bottom w:type="dxa" w:w="80"/>
-              <w:right w:type="dxa" w:w="100"/>
-            </w:tcMar>
-          </w:tcPr>
-          <w:p>
-            <w:r>
-              <w:rPr>
-                <w:b/>
-                <w:bCs/>
-              </w:rPr>
-              <w:t xml:space="preserve">Route</w:t>
-            </w:r>
-          </w:p>
-        </w:tc>
-        <w:tc>
-          <w:tcPr>
-            <w:shd w:fill="DDDDDD" w:color="auto" w:val="clear"/>
-            <w:tcMar>
-              <w:top w:type="dxa" w:w="80"/>
-              <w:left w:type="dxa" w:w="100"/>
-              <w:bottom w:type="dxa" w:w="80"/>
-              <w:right w:type="dxa" w:w="100"/>
-            </w:tcMar>
-          </w:tcPr>
-          <w:p>
-            <w:r>
-              <w:rPr>
-                <w:b/>
-                <w:bCs/>
-              </w:rPr>
-              <w:t xml:space="preserve">Purpose</w:t>
-            </w:r>
-          </w:p>
-        </w:tc>
-      </w:tr>
-      <w:tr>
-        <w:tc>
-          <w:tcPr>
-            <w:tcMar>
-              <w:top w:type="dxa" w:w="80"/>
-              <w:left w:type="dxa" w:w="100"/>
-              <w:bottom w:type="dxa" w:w="80"/>
-              <w:right w:type="dxa" w:w="100"/>
-            </w:tcMar>
-          </w:tcPr>
-          <w:p>
-            <w:r>
-              <w:t xml:space="preserve">Sales Summary</w:t>
-            </w:r>
-          </w:p>
-        </w:tc>
-        <w:tc>
-          <w:tcPr>
-            <w:tcMar>
-              <w:top w:type="dxa" w:w="80"/>
-              <w:left w:type="dxa" w:w="100"/>
-              <w:bottom w:type="dxa" w:w="80"/>
-              <w:right w:type="dxa" w:w="100"/>
-            </w:tcMar>
-          </w:tcPr>
-          <w:p>
-            <w:r>
-              <w:t xml:space="preserve">/reports/sales/summary</w:t>
-            </w:r>
-          </w:p>
-        </w:tc>
-        <w:tc>
-          <w:tcPr>
-            <w:tcMar>
-              <w:top w:type="dxa" w:w="80"/>
-              <w:left w:type="dxa" w:w="100"/>
-              <w:bottom w:type="dxa" w:w="80"/>
-              <w:right w:type="dxa" w:w="100"/>
-            </w:tcMar>
-          </w:tcPr>
-          <w:p>
-            <w:r>
-              <w:t xml:space="preserve">Total sales for a chosen period, broken down by day.</w:t>
-            </w:r>
-          </w:p>
-        </w:tc>
-      </w:tr>
-      <w:tr>
-        <w:tc>
-          <w:tcPr>
-            <w:tcMar>
-              <w:top w:type="dxa" w:w="80"/>
-              <w:left w:type="dxa" w:w="100"/>
-              <w:bottom w:type="dxa" w:w="80"/>
-              <w:right w:type="dxa" w:w="100"/>
-            </w:tcMar>
-          </w:tcPr>
-          <w:p>
-            <w:r>
-              <w:t xml:space="preserve">Sales by Product/Service</w:t>
-            </w:r>
-          </w:p>
-        </w:tc>
-        <w:tc>
-          <w:tcPr>
-            <w:tcMar>
-              <w:top w:type="dxa" w:w="80"/>
-              <w:left w:type="dxa" w:w="100"/>
-              <w:bottom w:type="dxa" w:w="80"/>
-              <w:right w:type="dxa" w:w="100"/>
-            </w:tcMar>
-          </w:tcPr>
-          <w:p>
-            <w:r>
-              <w:t xml:space="preserve">/reports/sales/by-product</w:t>
-            </w:r>
-          </w:p>
-        </w:tc>
-        <w:tc>
-          <w:tcPr>
-            <w:tcMar>
-              <w:top w:type="dxa" w:w="80"/>
-              <w:left w:type="dxa" w:w="100"/>
-              <w:bottom w:type="dxa" w:w="80"/>
-              <w:right w:type="dxa" w:w="100"/>
-            </w:tcMar>
-          </w:tcPr>
-          <w:p>
-            <w:r>
-              <w:t xml:space="preserve">How much of each product or service sold and its revenue.</w:t>
-            </w:r>
-          </w:p>
-        </w:tc>
-      </w:tr>
-      <w:tr>
-        <w:tc>
-          <w:tcPr>
-            <w:tcMar>
-              <w:top w:type="dxa" w:w="80"/>
-              <w:left w:type="dxa" w:w="100"/>
-              <w:bottom w:type="dxa" w:w="80"/>
-              <w:right w:type="dxa" w:w="100"/>
-            </w:tcMar>
-          </w:tcPr>
-          <w:p>
-            <w:r>
-              <w:t xml:space="preserve">Sales by Customer</w:t>
-            </w:r>
-          </w:p>
-        </w:tc>
-        <w:tc>
-          <w:tcPr>
-            <w:tcMar>
-              <w:top w:type="dxa" w:w="80"/>
-              <w:left w:type="dxa" w:w="100"/>
-              <w:bottom w:type="dxa" w:w="80"/>
-              <w:right w:type="dxa" w:w="100"/>
-            </w:tcMar>
-          </w:tcPr>
-          <w:p>
-            <w:r>
-              <w:t xml:space="preserve">/reports/sales/by-customer</w:t>
-            </w:r>
-          </w:p>
-        </w:tc>
-        <w:tc>
-          <w:tcPr>
-            <w:tcMar>
-              <w:top w:type="dxa" w:w="80"/>
-              <w:left w:type="dxa" w:w="100"/>
-              <w:bottom w:type="dxa" w:w="80"/>
-              <w:right w:type="dxa" w:w="100"/>
-            </w:tcMar>
-          </w:tcPr>
-          <w:p>
-            <w:r>
-              <w:t xml:space="preserve">Total sales grouped by customer, useful for tracking your best accounts.</w:t>
-            </w:r>
-          </w:p>
-        </w:tc>
-      </w:tr>
-      <w:tr>
-        <w:tc>
-          <w:tcPr>
-            <w:tcMar>
-              <w:top w:type="dxa" w:w="80"/>
-              <w:left w:type="dxa" w:w="100"/>
-              <w:bottom w:type="dxa" w:w="80"/>
-              <w:right w:type="dxa" w:w="100"/>
-            </w:tcMar>
-          </w:tcPr>
-          <w:p>
-            <w:r>
-              <w:t xml:space="preserve">Top Sales</w:t>
-            </w:r>
-          </w:p>
-        </w:tc>
-        <w:tc>
-          <w:tcPr>
-            <w:tcMar>
-              <w:top w:type="dxa" w:w="80"/>
-              <w:left w:type="dxa" w:w="100"/>
-              <w:bottom w:type="dxa" w:w="80"/>
-              <w:right w:type="dxa" w:w="100"/>
-            </w:tcMar>
-          </w:tcPr>
-          <w:p>
-            <w:r>
-              <w:t xml:space="preserve">/reports/sales/top-sales</w:t>
-            </w:r>
-          </w:p>
-        </w:tc>
-        <w:tc>
-          <w:tcPr>
-            <w:tcMar>
-              <w:top w:type="dxa" w:w="80"/>
-              <w:left w:type="dxa" w:w="100"/>
-              <w:bottom w:type="dxa" w:w="80"/>
-              <w:right w:type="dxa" w:w="100"/>
-            </w:tcMar>
-          </w:tcPr>
-          <w:p>
-            <w:r>
-              <w:t xml:space="preserve">Best-selling products ranked by revenue.</w:t>
-            </w:r>
-          </w:p>
-        </w:tc>
-      </w:tr>
-      <w:tr>
-        <w:tc>
-          <w:tcPr>
-            <w:tcMar>
-              <w:top w:type="dxa" w:w="80"/>
-              <w:left w:type="dxa" w:w="100"/>
-              <w:bottom w:type="dxa" w:w="80"/>
-              <w:right w:type="dxa" w:w="100"/>
-            </w:tcMar>
-          </w:tcPr>
-          <w:p>
-            <w:r>
-              <w:t xml:space="preserve">Top Volume</w:t>
-            </w:r>
-          </w:p>
-        </w:tc>
-        <w:tc>
-          <w:tcPr>
-            <w:tcMar>
-              <w:top w:type="dxa" w:w="80"/>
-              <w:left w:type="dxa" w:w="100"/>
-              <w:bottom w:type="dxa" w:w="80"/>
-              <w:right w:type="dxa" w:w="100"/>
-            </w:tcMar>
-          </w:tcPr>
-          <w:p>
-            <w:r>
-              <w:t xml:space="preserve">/reports/sales/top-volume</w:t>
-            </w:r>
-          </w:p>
-        </w:tc>
-        <w:tc>
-          <w:tcPr>
-            <w:tcMar>
-              <w:top w:type="dxa" w:w="80"/>
-              <w:left w:type="dxa" w:w="100"/>
-              <w:bottom w:type="dxa" w:w="80"/>
-              <w:right w:type="dxa" w:w="100"/>
-            </w:tcMar>
-          </w:tcPr>
-          <w:p>
-            <w:r>
-              <w:t xml:space="preserve">Best-selling products ranked by quantity sold.</w:t>
-            </w:r>
-          </w:p>
-        </w:tc>
-      </w:tr>
-      <w:tr>
-        <w:tc>
-          <w:tcPr>
-            <w:tcMar>
-              <w:top w:type="dxa" w:w="80"/>
-              <w:left w:type="dxa" w:w="100"/>
-              <w:bottom w:type="dxa" w:w="80"/>
-              <w:right w:type="dxa" w:w="100"/>
-            </w:tcMar>
-          </w:tcPr>
-          <w:p>
-            <w:r>
-              <w:t xml:space="preserve">Profit Margin</w:t>
-            </w:r>
-          </w:p>
-        </w:tc>
-        <w:tc>
-          <w:tcPr>
-            <w:tcMar>
-              <w:top w:type="dxa" w:w="80"/>
-              <w:left w:type="dxa" w:w="100"/>
-              <w:bottom w:type="dxa" w:w="80"/>
-              <w:right w:type="dxa" w:w="100"/>
-            </w:tcMar>
-          </w:tcPr>
-          <w:p>
-            <w:r>
-              <w:t xml:space="preserve">/reports/sales/profit-margin</w:t>
-            </w:r>
-          </w:p>
-        </w:tc>
-        <w:tc>
-          <w:tcPr>
-            <w:tcMar>
-              <w:top w:type="dxa" w:w="80"/>
-              <w:left w:type="dxa" w:w="100"/>
-              <w:bottom w:type="dxa" w:w="80"/>
-              <w:right w:type="dxa" w:w="100"/>
-            </w:tcMar>
-          </w:tcPr>
-          <w:p>
-            <w:r>
-              <w:t xml:space="preserve">Profit margin per product, comparing cost against selling price.</w:t>
-            </w:r>
-          </w:p>
-        </w:tc>
-      </w:tr>
-      <w:tr>
-        <w:tc>
-          <w:tcPr>
-            <w:tcMar>
-              <w:top w:type="dxa" w:w="80"/>
-              <w:left w:type="dxa" w:w="100"/>
-              <w:bottom w:type="dxa" w:w="80"/>
-              <w:right w:type="dxa" w:w="100"/>
-            </w:tcMar>
-          </w:tcPr>
-          <w:p>
-            <w:r>
-              <w:t xml:space="preserve">Batch Profit</w:t>
-            </w:r>
-          </w:p>
-        </w:tc>
-        <w:tc>
-          <w:tcPr>
-            <w:tcMar>
-              <w:top w:type="dxa" w:w="80"/>
-              <w:left w:type="dxa" w:w="100"/>
-              <w:bottom w:type="dxa" w:w="80"/>
-              <w:right w:type="dxa" w:w="100"/>
-            </w:tcMar>
-          </w:tcPr>
-          <w:p>
-            <w:r>
-              <w:t xml:space="preserve">/reports/sales/batch-profit</w:t>
-            </w:r>
-          </w:p>
-        </w:tc>
-        <w:tc>
-          <w:tcPr>
-            <w:tcMar>
-              <w:top w:type="dxa" w:w="80"/>
-              <w:left w:type="dxa" w:w="100"/>
-              <w:bottom w:type="dxa" w:w="80"/>
-              <w:right w:type="dxa" w:w="100"/>
-            </w:tcMar>
-          </w:tcPr>
-          <w:p>
-            <w:r>
-              <w:t xml:space="preserve">Profit calculated per FIFO cost batch, showing which stock batches were most profitable.</w:t>
-            </w:r>
-          </w:p>
-        </w:tc>
-      </w:tr>
-      <w:tr>
-        <w:tc>
-          <w:tcPr>
-            <w:tcMar>
-              <w:top w:type="dxa" w:w="80"/>
-              <w:left w:type="dxa" w:w="100"/>
-              <w:bottom w:type="dxa" w:w="80"/>
-              <w:right w:type="dxa" w:w="100"/>
-            </w:tcMar>
-          </w:tcPr>
-          <w:p>
-            <w:r>
-              <w:t xml:space="preserve">Discounts</w:t>
-            </w:r>
-          </w:p>
-        </w:tc>
-        <w:tc>
-          <w:tcPr>
-            <w:tcMar>
-              <w:top w:type="dxa" w:w="80"/>
-              <w:left w:type="dxa" w:w="100"/>
-              <w:bottom w:type="dxa" w:w="80"/>
-              <w:right w:type="dxa" w:w="100"/>
-            </w:tcMar>
-          </w:tcPr>
-          <w:p>
-            <w:r>
-              <w:t xml:space="preserve">/reports/sales/discounts</w:t>
-            </w:r>
-          </w:p>
-        </w:tc>
-        <w:tc>
-          <w:tcPr>
-            <w:tcMar>
-              <w:top w:type="dxa" w:w="80"/>
-              <w:left w:type="dxa" w:w="100"/>
-              <w:bottom w:type="dxa" w:w="80"/>
-              <w:right w:type="dxa" w:w="100"/>
-            </w:tcMar>
-          </w:tcPr>
-          <w:p>
-            <w:r>
-              <w:t xml:space="preserve">All discounts given, by cashier, product, or period.</w:t>
-            </w:r>
-          </w:p>
-        </w:tc>
-      </w:tr>
-      <w:tr>
-        <w:tc>
-          <w:tcPr>
-            <w:tcMar>
-              <w:top w:type="dxa" w:w="80"/>
-              <w:left w:type="dxa" w:w="100"/>
-              <w:bottom w:type="dxa" w:w="80"/>
-              <w:right w:type="dxa" w:w="100"/>
-            </w:tcMar>
-          </w:tcPr>
-          <w:p>
-            <w:r>
-              <w:t xml:space="preserve">Split Payments</w:t>
-            </w:r>
-          </w:p>
-        </w:tc>
-        <w:tc>
-          <w:tcPr>
-            <w:tcMar>
-              <w:top w:type="dxa" w:w="80"/>
-              <w:left w:type="dxa" w:w="100"/>
-              <w:bottom w:type="dxa" w:w="80"/>
-              <w:right w:type="dxa" w:w="100"/>
-            </w:tcMar>
-          </w:tcPr>
-          <w:p>
-            <w:r>
-              <w:t xml:space="preserve">/reports/sales/split-payments</w:t>
-            </w:r>
-          </w:p>
-        </w:tc>
-        <w:tc>
-          <w:tcPr>
-            <w:tcMar>
-              <w:top w:type="dxa" w:w="80"/>
-              <w:left w:type="dxa" w:w="100"/>
-              <w:bottom w:type="dxa" w:w="80"/>
-              <w:right w:type="dxa" w:w="100"/>
-            </w:tcMar>
-          </w:tcPr>
-          <w:p>
-            <w:r>
-              <w:t xml:space="preserve">Sales paid using more than one payment method.</w:t>
-            </w:r>
-          </w:p>
-        </w:tc>
-      </w:tr>
-      <w:tr>
-        <w:tc>
-          <w:tcPr>
-            <w:tcMar>
-              <w:top w:type="dxa" w:w="80"/>
-              <w:left w:type="dxa" w:w="100"/>
-              <w:bottom w:type="dxa" w:w="80"/>
-              <w:right w:type="dxa" w:w="100"/>
-            </w:tcMar>
-          </w:tcPr>
-          <w:p>
-            <w:r>
-              <w:t xml:space="preserve">Returns</w:t>
-            </w:r>
-          </w:p>
-        </w:tc>
-        <w:tc>
-          <w:tcPr>
-            <w:tcMar>
-              <w:top w:type="dxa" w:w="80"/>
-              <w:left w:type="dxa" w:w="100"/>
-              <w:bottom w:type="dxa" w:w="80"/>
-              <w:right w:type="dxa" w:w="100"/>
-            </w:tcMar>
-          </w:tcPr>
-          <w:p>
-            <w:r>
-              <w:t xml:space="preserve">/reports/sales/returns</w:t>
-            </w:r>
-          </w:p>
-        </w:tc>
-        <w:tc>
-          <w:tcPr>
-            <w:tcMar>
-              <w:top w:type="dxa" w:w="80"/>
-              <w:left w:type="dxa" w:w="100"/>
-              <w:bottom w:type="dxa" w:w="80"/>
-              <w:right w:type="dxa" w:w="100"/>
-            </w:tcMar>
-          </w:tcPr>
-          <w:p>
-            <w:r>
-              <w:t xml:space="preserve">Merchandise credits and returned items.</w:t>
-            </w:r>
-          </w:p>
-        </w:tc>
-      </w:tr>
-      <w:tr>
-        <w:tc>
-          <w:tcPr>
-            <w:tcMar>
-              <w:top w:type="dxa" w:w="80"/>
-              <w:left w:type="dxa" w:w="100"/>
-              <w:bottom w:type="dxa" w:w="80"/>
-              <w:right w:type="dxa" w:w="100"/>
-            </w:tcMar>
-          </w:tcPr>
-          <w:p>
-            <w:r>
-              <w:t xml:space="preserve">BIR Summary</w:t>
-            </w:r>
-          </w:p>
-        </w:tc>
-        <w:tc>
-          <w:tcPr>
-            <w:tcMar>
-              <w:top w:type="dxa" w:w="80"/>
-              <w:left w:type="dxa" w:w="100"/>
-              <w:bottom w:type="dxa" w:w="80"/>
-              <w:right w:type="dxa" w:w="100"/>
-            </w:tcMar>
-          </w:tcPr>
-          <w:p>
-            <w:r>
-              <w:t xml:space="preserve">/reports/sales/bir-summary</w:t>
-            </w:r>
-          </w:p>
-        </w:tc>
-        <w:tc>
-          <w:tcPr>
-            <w:tcMar>
-              <w:top w:type="dxa" w:w="80"/>
-              <w:left w:type="dxa" w:w="100"/>
-              <w:bottom w:type="dxa" w:w="80"/>
-              <w:right w:type="dxa" w:w="100"/>
-            </w:tcMar>
-          </w:tcPr>
-          <w:p>
-            <w:r>
-              <w:t xml:space="preserve">Official BIR-format summary of sales invoice numbers and totals for tax filing.</w:t>
-            </w:r>
-          </w:p>
-        </w:tc>
-      </w:tr>
-      <w:tr>
-        <w:tc>
-          <w:tcPr>
-            <w:tcMar>
-              <w:top w:type="dxa" w:w="80"/>
-              <w:left w:type="dxa" w:w="100"/>
-              <w:bottom w:type="dxa" w:w="80"/>
-              <w:right w:type="dxa" w:w="100"/>
-            </w:tcMar>
-          </w:tcPr>
-          <w:p>
-            <w:r>
-              <w:t xml:space="preserve">Purchases Summary</w:t>
-            </w:r>
-          </w:p>
-        </w:tc>
-        <w:tc>
-          <w:tcPr>
-            <w:tcMar>
-              <w:top w:type="dxa" w:w="80"/>
-              <w:left w:type="dxa" w:w="100"/>
-              <w:bottom w:type="dxa" w:w="80"/>
-              <w:right w:type="dxa" w:w="100"/>
-            </w:tcMar>
-          </w:tcPr>
-          <w:p>
-            <w:r>
-              <w:t xml:space="preserve">/reports/purchases/summary</w:t>
-            </w:r>
-          </w:p>
-        </w:tc>
-        <w:tc>
-          <w:tcPr>
-            <w:tcMar>
-              <w:top w:type="dxa" w:w="80"/>
-              <w:left w:type="dxa" w:w="100"/>
-              <w:bottom w:type="dxa" w:w="80"/>
-              <w:right w:type="dxa" w:w="100"/>
-            </w:tcMar>
-          </w:tcPr>
-          <w:p>
-            <w:r>
-              <w:t xml:space="preserve">Total purchase spend for a chosen period.</w:t>
-            </w:r>
-          </w:p>
-        </w:tc>
-      </w:tr>
-      <w:tr>
-        <w:tc>
-          <w:tcPr>
-            <w:tcMar>
-              <w:top w:type="dxa" w:w="80"/>
-              <w:left w:type="dxa" w:w="100"/>
-              <w:bottom w:type="dxa" w:w="80"/>
-              <w:right w:type="dxa" w:w="100"/>
-            </w:tcMar>
-          </w:tcPr>
-          <w:p>
-            <w:r>
-              <w:t xml:space="preserve">Purchases by Supplier</w:t>
-            </w:r>
-          </w:p>
-        </w:tc>
-        <w:tc>
-          <w:tcPr>
-            <w:tcMar>
-              <w:top w:type="dxa" w:w="80"/>
-              <w:left w:type="dxa" w:w="100"/>
-              <w:bottom w:type="dxa" w:w="80"/>
-              <w:right w:type="dxa" w:w="100"/>
-            </w:tcMar>
-          </w:tcPr>
-          <w:p>
-            <w:r>
-              <w:t xml:space="preserve">/reports/purchases/by-supplier</w:t>
-            </w:r>
-          </w:p>
-        </w:tc>
-        <w:tc>
-          <w:tcPr>
-            <w:tcMar>
-              <w:top w:type="dxa" w:w="80"/>
-              <w:left w:type="dxa" w:w="100"/>
-              <w:bottom w:type="dxa" w:w="80"/>
-              <w:right w:type="dxa" w:w="100"/>
-            </w:tcMar>
-          </w:tcPr>
-          <w:p>
-            <w:r>
-              <w:t xml:space="preserve">Purchases grouped by supplier, showing who you buy the most from.</w:t>
-            </w:r>
-          </w:p>
-        </w:tc>
-      </w:tr>
-      <w:tr>
-        <w:tc>
-          <w:tcPr>
-            <w:tcMar>
-              <w:top w:type="dxa" w:w="80"/>
-              <w:left w:type="dxa" w:w="100"/>
-              <w:bottom w:type="dxa" w:w="80"/>
-              <w:right w:type="dxa" w:w="100"/>
-            </w:tcMar>
-          </w:tcPr>
-          <w:p>
-            <w:r>
-              <w:t xml:space="preserve">Purchases by Product</w:t>
-            </w:r>
-          </w:p>
-        </w:tc>
-        <w:tc>
-          <w:tcPr>
-            <w:tcMar>
-              <w:top w:type="dxa" w:w="80"/>
-              <w:left w:type="dxa" w:w="100"/>
-              <w:bottom w:type="dxa" w:w="80"/>
-              <w:right w:type="dxa" w:w="100"/>
-            </w:tcMar>
-          </w:tcPr>
-          <w:p>
-            <w:r>
-              <w:t xml:space="preserve">/reports/purchases/by-product</w:t>
-            </w:r>
-          </w:p>
-        </w:tc>
-        <w:tc>
-          <w:tcPr>
-            <w:tcMar>
-              <w:top w:type="dxa" w:w="80"/>
-              <w:left w:type="dxa" w:w="100"/>
-              <w:bottom w:type="dxa" w:w="80"/>
-              <w:right w:type="dxa" w:w="100"/>
-            </w:tcMar>
-          </w:tcPr>
-          <w:p>
-            <w:r>
-              <w:t xml:space="preserve">Purchases grouped by product, showing what you restock most often.</w:t>
-            </w:r>
-          </w:p>
-        </w:tc>
-      </w:tr>
-      <w:tr>
-        <w:tc>
-          <w:tcPr>
-            <w:tcMar>
-              <w:top w:type="dxa" w:w="80"/>
-              <w:left w:type="dxa" w:w="100"/>
-              <w:bottom w:type="dxa" w:w="80"/>
-              <w:right w:type="dxa" w:w="100"/>
-            </w:tcMar>
-          </w:tcPr>
-          <w:p>
-            <w:r>
-              <w:t xml:space="preserve">Inventory</w:t>
-            </w:r>
-          </w:p>
-        </w:tc>
-        <w:tc>
-          <w:tcPr>
-            <w:tcMar>
-              <w:top w:type="dxa" w:w="80"/>
-              <w:left w:type="dxa" w:w="100"/>
-              <w:bottom w:type="dxa" w:w="80"/>
-              <w:right w:type="dxa" w:w="100"/>
-            </w:tcMar>
-          </w:tcPr>
-          <w:p>
-            <w:r>
-              <w:t xml:space="preserve">/reports/inventory</w:t>
-            </w:r>
-          </w:p>
-        </w:tc>
-        <w:tc>
-          <w:tcPr>
-            <w:tcMar>
-              <w:top w:type="dxa" w:w="80"/>
-              <w:left w:type="dxa" w:w="100"/>
-              <w:bottom w:type="dxa" w:w="80"/>
-              <w:right w:type="dxa" w:w="100"/>
-            </w:tcMar>
-          </w:tcPr>
-          <w:p>
-            <w:r>
-              <w:t xml:space="preserve">A full snapshot of current stock levels across all products.</w:t>
-            </w:r>
-          </w:p>
-        </w:tc>
-      </w:tr>
-      <w:tr>
-        <w:tc>
-          <w:tcPr>
-            <w:tcMar>
-              <w:top w:type="dxa" w:w="80"/>
-              <w:left w:type="dxa" w:w="100"/>
-              <w:bottom w:type="dxa" w:w="80"/>
-              <w:right w:type="dxa" w:w="100"/>
-            </w:tcMar>
-          </w:tcPr>
-          <w:p>
-            <w:r>
-              <w:t xml:space="preserve">Low Stock</w:t>
-            </w:r>
-          </w:p>
-        </w:tc>
-        <w:tc>
-          <w:tcPr>
-            <w:tcMar>
-              <w:top w:type="dxa" w:w="80"/>
-              <w:left w:type="dxa" w:w="100"/>
-              <w:bottom w:type="dxa" w:w="80"/>
-              <w:right w:type="dxa" w:w="100"/>
-            </w:tcMar>
-          </w:tcPr>
-          <w:p>
-            <w:r>
-              <w:t xml:space="preserve">/reports/low-stock</w:t>
-            </w:r>
-          </w:p>
-        </w:tc>
-        <w:tc>
-          <w:tcPr>
-            <w:tcMar>
-              <w:top w:type="dxa" w:w="80"/>
-              <w:left w:type="dxa" w:w="100"/>
-              <w:bottom w:type="dxa" w:w="80"/>
-              <w:right w:type="dxa" w:w="100"/>
-            </w:tcMar>
-          </w:tcPr>
-          <w:p>
-            <w:r>
-              <w:t xml:space="preserve">Products that have fallen below their reorder point and need restocking.</w:t>
-            </w:r>
-          </w:p>
-        </w:tc>
-      </w:tr>
-      <w:tr>
-        <w:tc>
-          <w:tcPr>
-            <w:tcMar>
-              <w:top w:type="dxa" w:w="80"/>
-              <w:left w:type="dxa" w:w="100"/>
-              <w:bottom w:type="dxa" w:w="80"/>
-              <w:right w:type="dxa" w:w="100"/>
-            </w:tcMar>
-          </w:tcPr>
-          <w:p>
-            <w:r>
-              <w:t xml:space="preserve">Expiring Soon</w:t>
-            </w:r>
-          </w:p>
-        </w:tc>
-        <w:tc>
-          <w:tcPr>
-            <w:tcMar>
-              <w:top w:type="dxa" w:w="80"/>
-              <w:left w:type="dxa" w:w="100"/>
-              <w:bottom w:type="dxa" w:w="80"/>
-              <w:right w:type="dxa" w:w="100"/>
-            </w:tcMar>
-          </w:tcPr>
-          <w:p>
-            <w:r>
-              <w:t xml:space="preserve">/reports/expiring-soon</w:t>
-            </w:r>
-          </w:p>
-        </w:tc>
-        <w:tc>
-          <w:tcPr>
-            <w:tcMar>
-              <w:top w:type="dxa" w:w="80"/>
-              <w:left w:type="dxa" w:w="100"/>
-              <w:bottom w:type="dxa" w:w="80"/>
-              <w:right w:type="dxa" w:w="100"/>
-            </w:tcMar>
-          </w:tcPr>
-          <w:p>
-            <w:r>
-              <w:t xml:space="preserve">Products approaching their expiration date, so they can be sold or pulled first.</w:t>
-            </w:r>
-          </w:p>
-        </w:tc>
-      </w:tr>
-      <w:tr>
-        <w:tc>
-          <w:tcPr>
-            <w:tcMar>
-              <w:top w:type="dxa" w:w="80"/>
-              <w:left w:type="dxa" w:w="100"/>
-              <w:bottom w:type="dxa" w:w="80"/>
-              <w:right w:type="dxa" w:w="100"/>
-            </w:tcMar>
-          </w:tcPr>
-          <w:p>
-            <w:r>
-              <w:t xml:space="preserve">Cost vs Retail</w:t>
-            </w:r>
-          </w:p>
-        </w:tc>
-        <w:tc>
-          <w:tcPr>
-            <w:tcMar>
-              <w:top w:type="dxa" w:w="80"/>
-              <w:left w:type="dxa" w:w="100"/>
-              <w:bottom w:type="dxa" w:w="80"/>
-              <w:right w:type="dxa" w:w="100"/>
-            </w:tcMar>
-          </w:tcPr>
-          <w:p>
-            <w:r>
-              <w:t xml:space="preserve">/reports/cost-vs-retail</w:t>
-            </w:r>
-          </w:p>
-        </w:tc>
-        <w:tc>
-          <w:tcPr>
-            <w:tcMar>
-              <w:top w:type="dxa" w:w="80"/>
-              <w:left w:type="dxa" w:w="100"/>
-              <w:bottom w:type="dxa" w:w="80"/>
-              <w:right w:type="dxa" w:w="100"/>
-            </w:tcMar>
-          </w:tcPr>
-          <w:p>
-            <w:r>
-              <w:t xml:space="preserve">Side-by-side comparison of product cost and retail price to check markups.</w:t>
-            </w:r>
-          </w:p>
-        </w:tc>
-      </w:tr>
-      <w:tr>
-        <w:tc>
-          <w:tcPr>
-            <w:tcMar>
-              <w:top w:type="dxa" w:w="80"/>
-              <w:left w:type="dxa" w:w="100"/>
-              <w:bottom w:type="dxa" w:w="80"/>
-              <w:right w:type="dxa" w:w="100"/>
-            </w:tcMar>
-          </w:tcPr>
-          <w:p>
-            <w:r>
-              <w:t xml:space="preserve">Movements</w:t>
-            </w:r>
-          </w:p>
-        </w:tc>
-        <w:tc>
-          <w:tcPr>
-            <w:tcMar>
-              <w:top w:type="dxa" w:w="80"/>
-              <w:left w:type="dxa" w:w="100"/>
-              <w:bottom w:type="dxa" w:w="80"/>
-              <w:right w:type="dxa" w:w="100"/>
-            </w:tcMar>
-          </w:tcPr>
-          <w:p>
-            <w:r>
-              <w:t xml:space="preserve">/reports/movements</w:t>
-            </w:r>
-          </w:p>
-        </w:tc>
-        <w:tc>
-          <w:tcPr>
-            <w:tcMar>
-              <w:top w:type="dxa" w:w="80"/>
-              <w:left w:type="dxa" w:w="100"/>
-              <w:bottom w:type="dxa" w:w="80"/>
-              <w:right w:type="dxa" w:w="100"/>
-            </w:tcMar>
-          </w:tcPr>
-          <w:p>
-            <w:r>
-              <w:t xml:space="preserve">Full log of every stock movement — sales, purchases, transfers, and adjustments.</w:t>
-            </w:r>
-          </w:p>
-        </w:tc>
-      </w:tr>
-      <w:tr>
-        <w:tc>
-          <w:tcPr>
-            <w:tcMar>
-              <w:top w:type="dxa" w:w="80"/>
-              <w:left w:type="dxa" w:w="100"/>
-              <w:bottom w:type="dxa" w:w="80"/>
-              <w:right w:type="dxa" w:w="100"/>
-            </w:tcMar>
-          </w:tcPr>
-          <w:p>
-            <w:r>
-              <w:t xml:space="preserve">Adjustments</w:t>
-            </w:r>
-          </w:p>
-        </w:tc>
-        <w:tc>
-          <w:tcPr>
-            <w:tcMar>
-              <w:top w:type="dxa" w:w="80"/>
-              <w:left w:type="dxa" w:w="100"/>
-              <w:bottom w:type="dxa" w:w="80"/>
-              <w:right w:type="dxa" w:w="100"/>
-            </w:tcMar>
-          </w:tcPr>
-          <w:p>
-            <w:r>
-              <w:t xml:space="preserve">/reports/adjustments</w:t>
-            </w:r>
-          </w:p>
-        </w:tc>
-        <w:tc>
-          <w:tcPr>
-            <w:tcMar>
-              <w:top w:type="dxa" w:w="80"/>
-              <w:left w:type="dxa" w:w="100"/>
-              <w:bottom w:type="dxa" w:w="80"/>
-              <w:right w:type="dxa" w:w="100"/>
-            </w:tcMar>
-          </w:tcPr>
-          <w:p>
-            <w:r>
-              <w:t xml:space="preserve">Manual stock adjustments only, with reasons and approval status.</w:t>
-            </w:r>
-          </w:p>
-        </w:tc>
-      </w:tr>
-      <w:tr>
-        <w:tc>
-          <w:tcPr>
-            <w:tcMar>
-              <w:top w:type="dxa" w:w="80"/>
-              <w:left w:type="dxa" w:w="100"/>
-              <w:bottom w:type="dxa" w:w="80"/>
-              <w:right w:type="dxa" w:w="100"/>
-            </w:tcMar>
-          </w:tcPr>
-          <w:p>
-            <w:r>
-              <w:t xml:space="preserve">Velocity</w:t>
-            </w:r>
-          </w:p>
-        </w:tc>
-        <w:tc>
-          <w:tcPr>
-            <w:tcMar>
-              <w:top w:type="dxa" w:w="80"/>
-              <w:left w:type="dxa" w:w="100"/>
-              <w:bottom w:type="dxa" w:w="80"/>
-              <w:right w:type="dxa" w:w="100"/>
-            </w:tcMar>
-          </w:tcPr>
-          <w:p>
-            <w:r>
-              <w:t xml:space="preserve">/reports/velocity</w:t>
-            </w:r>
-          </w:p>
-        </w:tc>
-        <w:tc>
-          <w:tcPr>
-            <w:tcMar>
-              <w:top w:type="dxa" w:w="80"/>
-              <w:left w:type="dxa" w:w="100"/>
-              <w:bottom w:type="dxa" w:w="80"/>
-              <w:right w:type="dxa" w:w="100"/>
-            </w:tcMar>
-          </w:tcPr>
-          <w:p>
-            <w:r>
-              <w:t xml:space="preserve">How fast each product sells, useful for planning reorder quantities.</w:t>
-            </w:r>
-          </w:p>
-        </w:tc>
-      </w:tr>
-      <w:tr>
-        <w:tc>
-          <w:tcPr>
-            <w:tcMar>
-              <w:top w:type="dxa" w:w="80"/>
-              <w:left w:type="dxa" w:w="100"/>
-              <w:bottom w:type="dxa" w:w="80"/>
-              <w:right w:type="dxa" w:w="100"/>
-            </w:tcMar>
-          </w:tcPr>
-          <w:p>
-            <w:r>
-              <w:t xml:space="preserve">Membership</w:t>
-            </w:r>
-          </w:p>
-        </w:tc>
-        <w:tc>
-          <w:tcPr>
-            <w:tcMar>
-              <w:top w:type="dxa" w:w="80"/>
-              <w:left w:type="dxa" w:w="100"/>
-              <w:bottom w:type="dxa" w:w="80"/>
-              <w:right w:type="dxa" w:w="100"/>
-            </w:tcMar>
-          </w:tcPr>
-          <w:p>
-            <w:r>
-              <w:t xml:space="preserve">/reports/membership</w:t>
-            </w:r>
-          </w:p>
-        </w:tc>
-        <w:tc>
-          <w:tcPr>
-            <w:tcMar>
-              <w:top w:type="dxa" w:w="80"/>
-              <w:left w:type="dxa" w:w="100"/>
-              <w:bottom w:type="dxa" w:w="80"/>
-              <w:right w:type="dxa" w:w="100"/>
-            </w:tcMar>
-          </w:tcPr>
-          <w:p>
-            <w:r>
-              <w:t xml:space="preserve">Membership activations and renewals, with amount, payment method, cashier, and how long each membership runs.</w:t>
-            </w:r>
-          </w:p>
-        </w:tc>
-      </w:tr>
-      <w:tr>
-        <w:tc>
-          <w:tcPr>
-            <w:tcMar>
-              <w:top w:type="dxa" w:w="80"/>
-              <w:left w:type="dxa" w:w="100"/>
-              <w:bottom w:type="dxa" w:w="80"/>
-              <w:right w:type="dxa" w:w="100"/>
-            </w:tcMar>
-          </w:tcPr>
-          <w:p>
-            <w:r>
-              <w:t xml:space="preserve">Fiscal Year</w:t>
-            </w:r>
-          </w:p>
-        </w:tc>
-        <w:tc>
-          <w:tcPr>
-            <w:tcMar>
-              <w:top w:type="dxa" w:w="80"/>
-              <w:left w:type="dxa" w:w="100"/>
-              <w:bottom w:type="dxa" w:w="80"/>
-              <w:right w:type="dxa" w:w="100"/>
-            </w:tcMar>
-          </w:tcPr>
-          <w:p>
-            <w:r>
-              <w:t xml:space="preserve">/reports/fiscal-year</w:t>
-            </w:r>
-          </w:p>
-        </w:tc>
-        <w:tc>
-          <w:tcPr>
-            <w:tcMar>
-              <w:top w:type="dxa" w:w="80"/>
-              <w:left w:type="dxa" w:w="100"/>
-              <w:bottom w:type="dxa" w:w="80"/>
-              <w:right w:type="dxa" w:w="100"/>
-            </w:tcMar>
-          </w:tcPr>
-          <w:p>
-            <w:r>
-              <w:t xml:space="preserve">Summary figures aligned to your store's configured fiscal year.</w:t>
-            </w:r>
-          </w:p>
-        </w:tc>
-      </w:tr>
-    </w:tbl>
-    <w:p/>
-    <w:p>
-      <w:pPr>
-        <w:shd w:fill="F8D0D0" w:color="auto" w:val="clear"/>
-        <w:spacing w:after="120" w:before="120"/>
-      </w:pPr>
-      <w:r>
-        <w:t xml:space="preserve">[SCREENSHOT MISSING: reports-membership]</w:t>
-      </w:r>
-    </w:p>
-    <w:p>
-      <w:pPr>
-        <w:pStyle w:val="Heading1"/>
-        <w:pageBreakBefore/>
-      </w:pPr>
-      <w:r>
-        <w:t xml:space="preserve">Chapter 9: Settings &amp; Users</w:t>
-      </w:r>
-    </w:p>
-    <w:p>
-      <w:pPr>
-        <w:spacing w:after="200"/>
-      </w:pPr>
-      <w:r>
-        <w:t xml:space="preserve">This chapter covers store-wide configuration — POS terminals, tax rates, and general settings — plus managing the user accounts allowed to log in to Verdix. These pages are for admins only and change how the whole system behaves, so treat them carefully.</w:t>
-      </w:r>
-    </w:p>
-    <w:p>
-      <w:pPr>
-        <w:pStyle w:val="Heading2"/>
-        <w:spacing w:before="200"/>
-      </w:pPr>
-      <w:r>
-        <w:t xml:space="preserve">The Settings hub</w:t>
-      </w:r>
-    </w:p>
-    <w:p>
-      <w:pPr>
-        <w:spacing w:after="160"/>
-      </w:pPr>
-      <w:r>
-        <w:t xml:space="preserve">Settings is organized into tiles, each opening a focused settings area: System Preferences, Notifications, Appearance, Data Management, POS Setup, Tax Rates, Pricing Configuration, Cache &amp; Refresh, and External API Integration.</w:t>
+        <w:t xml:space="preserve">Figure 30: Sales summary report</w:t>
+      </w:r>
+    </w:p>
+    <w:p>
+      <w:pPr>
+        <w:spacing w:after="160"/>
+      </w:pPr>
+      <w:r>
+        <w:t xml:space="preserve">Sales Summary gives a top-level view of a day's or period's total sales, useful for a quick daily check against your cash drawer count.</w:t>
       </w:r>
     </w:p>
     <w:p>
@@ -5978,15 +4736,15 @@
           <w:i/>
           <w:iCs/>
         </w:rPr>
-        <w:t xml:space="preserve">Figure 31: Settings</w:t>
-      </w:r>
-    </w:p>
-    <w:p>
-      <w:pPr>
-        <w:spacing w:after="160"/>
-      </w:pPr>
-      <w:r>
-        <w:t xml:space="preserve">Click any tile to open that settings area. The two most commonly used areas for day-to-day store operation — POS Setup and Tax Rates — are covered in more detail below.</w:t>
+        <w:t xml:space="preserve">Figure 31: Low stock report</w:t>
+      </w:r>
+    </w:p>
+    <w:p>
+      <w:pPr>
+        <w:spacing w:after="160"/>
+      </w:pPr>
+      <w:r>
+        <w:t xml:space="preserve">Low Stock lists every product that has fallen below its reorder point — check this before creating purchase orders so nothing is missed.</w:t>
       </w:r>
     </w:p>
     <w:p>
@@ -5995,56 +4753,1182 @@
         <w:spacing w:before="200"/>
       </w:pPr>
       <w:r>
-        <w:t xml:space="preserve">POS setup</w:t>
-      </w:r>
-    </w:p>
-    <w:p>
-      <w:pPr>
-        <w:spacing w:after="160"/>
-      </w:pPr>
-      <w:r>
-        <w:t xml:space="preserve">POS Setup configures how the checkout counter behaves. It is organized into tabs: Business (store name, logo, address), General (display and behavior options), Security, Confirmations (which actions require an extra confirmation step), BIR (Philippine tax compliance settings), and Data.</w:t>
-      </w:r>
-    </w:p>
-    <w:p>
-      <w:pPr>
-        <w:pStyle w:val="ListParagraph"/>
-        <w:numPr>
-          <w:ilvl w:val="0"/>
-          <w:numId w:val="2"/>
-        </w:numPr>
-        <w:spacing w:after="80"/>
-      </w:pPr>
-      <w:r>
-        <w:t xml:space="preserve">Go to Settings → POS Setup.</w:t>
-      </w:r>
-    </w:p>
-    <w:p>
-      <w:pPr>
-        <w:pStyle w:val="ListParagraph"/>
-        <w:numPr>
-          <w:ilvl w:val="0"/>
-          <w:numId w:val="2"/>
-        </w:numPr>
-        <w:spacing w:after="80"/>
-      </w:pPr>
-      <w:r>
-        <w:t xml:space="preserve">Choose the tab for the setting you need to change.</w:t>
-      </w:r>
-    </w:p>
-    <w:p>
-      <w:pPr>
-        <w:pStyle w:val="ListParagraph"/>
-        <w:numPr>
-          <w:ilvl w:val="0"/>
-          <w:numId w:val="2"/>
-        </w:numPr>
-        <w:spacing w:after="80"/>
-      </w:pPr>
-      <w:r>
-        <w:t xml:space="preserve">Make your changes, then click "Save Settings" at the top of the page.</w:t>
-      </w:r>
-    </w:p>
+        <w:t xml:space="preserve">Full report index</w:t>
+      </w:r>
+    </w:p>
+    <w:p>
+      <w:pPr>
+        <w:spacing w:after="160"/>
+      </w:pPr>
+      <w:r>
+        <w:t xml:space="preserve">The table below lists every report available in Verdix POS, with the menu path and a one-line description of what it shows.</w:t>
+      </w:r>
+    </w:p>
+    <w:tbl>
+      <w:tblPr>
+        <w:tblW w:type="pct" w:w="100%"/>
+        <w:tblBorders>
+          <w:top w:val="single" w:color="888888" w:sz="2"/>
+          <w:left w:val="single" w:color="888888" w:sz="2"/>
+          <w:bottom w:val="single" w:color="888888" w:sz="2"/>
+          <w:right w:val="single" w:color="888888" w:sz="2"/>
+          <w:insideH w:val="single" w:color="888888" w:sz="2"/>
+          <w:insideV w:val="single" w:color="888888" w:sz="2"/>
+        </w:tblBorders>
+      </w:tblPr>
+      <w:tblGrid>
+        <w:gridCol w:w="100"/>
+        <w:gridCol w:w="100"/>
+        <w:gridCol w:w="100"/>
+      </w:tblGrid>
+      <w:tr>
+        <w:trPr>
+          <w:tblHeader/>
+        </w:trPr>
+        <w:tc>
+          <w:tcPr>
+            <w:shd w:fill="DDDDDD" w:color="auto" w:val="clear"/>
+            <w:tcMar>
+              <w:top w:type="dxa" w:w="80"/>
+              <w:left w:type="dxa" w:w="100"/>
+              <w:bottom w:type="dxa" w:w="80"/>
+              <w:right w:type="dxa" w:w="100"/>
+            </w:tcMar>
+          </w:tcPr>
+          <w:p>
+            <w:r>
+              <w:rPr>
+                <w:b/>
+                <w:bCs/>
+              </w:rPr>
+              <w:t xml:space="preserve">Report</w:t>
+            </w:r>
+          </w:p>
+        </w:tc>
+        <w:tc>
+          <w:tcPr>
+            <w:shd w:fill="DDDDDD" w:color="auto" w:val="clear"/>
+            <w:tcMar>
+              <w:top w:type="dxa" w:w="80"/>
+              <w:left w:type="dxa" w:w="100"/>
+              <w:bottom w:type="dxa" w:w="80"/>
+              <w:right w:type="dxa" w:w="100"/>
+            </w:tcMar>
+          </w:tcPr>
+          <w:p>
+            <w:r>
+              <w:rPr>
+                <w:b/>
+                <w:bCs/>
+              </w:rPr>
+              <w:t xml:space="preserve">Route</w:t>
+            </w:r>
+          </w:p>
+        </w:tc>
+        <w:tc>
+          <w:tcPr>
+            <w:shd w:fill="DDDDDD" w:color="auto" w:val="clear"/>
+            <w:tcMar>
+              <w:top w:type="dxa" w:w="80"/>
+              <w:left w:type="dxa" w:w="100"/>
+              <w:bottom w:type="dxa" w:w="80"/>
+              <w:right w:type="dxa" w:w="100"/>
+            </w:tcMar>
+          </w:tcPr>
+          <w:p>
+            <w:r>
+              <w:rPr>
+                <w:b/>
+                <w:bCs/>
+              </w:rPr>
+              <w:t xml:space="preserve">Purpose</w:t>
+            </w:r>
+          </w:p>
+        </w:tc>
+      </w:tr>
+      <w:tr>
+        <w:tc>
+          <w:tcPr>
+            <w:tcMar>
+              <w:top w:type="dxa" w:w="80"/>
+              <w:left w:type="dxa" w:w="100"/>
+              <w:bottom w:type="dxa" w:w="80"/>
+              <w:right w:type="dxa" w:w="100"/>
+            </w:tcMar>
+          </w:tcPr>
+          <w:p>
+            <w:r>
+              <w:t xml:space="preserve">Sales Summary</w:t>
+            </w:r>
+          </w:p>
+        </w:tc>
+        <w:tc>
+          <w:tcPr>
+            <w:tcMar>
+              <w:top w:type="dxa" w:w="80"/>
+              <w:left w:type="dxa" w:w="100"/>
+              <w:bottom w:type="dxa" w:w="80"/>
+              <w:right w:type="dxa" w:w="100"/>
+            </w:tcMar>
+          </w:tcPr>
+          <w:p>
+            <w:r>
+              <w:t xml:space="preserve">/reports/sales/summary</w:t>
+            </w:r>
+          </w:p>
+        </w:tc>
+        <w:tc>
+          <w:tcPr>
+            <w:tcMar>
+              <w:top w:type="dxa" w:w="80"/>
+              <w:left w:type="dxa" w:w="100"/>
+              <w:bottom w:type="dxa" w:w="80"/>
+              <w:right w:type="dxa" w:w="100"/>
+            </w:tcMar>
+          </w:tcPr>
+          <w:p>
+            <w:r>
+              <w:t xml:space="preserve">Total sales for a chosen period, broken down by day.</w:t>
+            </w:r>
+          </w:p>
+        </w:tc>
+      </w:tr>
+      <w:tr>
+        <w:tc>
+          <w:tcPr>
+            <w:tcMar>
+              <w:top w:type="dxa" w:w="80"/>
+              <w:left w:type="dxa" w:w="100"/>
+              <w:bottom w:type="dxa" w:w="80"/>
+              <w:right w:type="dxa" w:w="100"/>
+            </w:tcMar>
+          </w:tcPr>
+          <w:p>
+            <w:r>
+              <w:t xml:space="preserve">Sales by Product/Service</w:t>
+            </w:r>
+          </w:p>
+        </w:tc>
+        <w:tc>
+          <w:tcPr>
+            <w:tcMar>
+              <w:top w:type="dxa" w:w="80"/>
+              <w:left w:type="dxa" w:w="100"/>
+              <w:bottom w:type="dxa" w:w="80"/>
+              <w:right w:type="dxa" w:w="100"/>
+            </w:tcMar>
+          </w:tcPr>
+          <w:p>
+            <w:r>
+              <w:t xml:space="preserve">/reports/sales/by-product</w:t>
+            </w:r>
+          </w:p>
+        </w:tc>
+        <w:tc>
+          <w:tcPr>
+            <w:tcMar>
+              <w:top w:type="dxa" w:w="80"/>
+              <w:left w:type="dxa" w:w="100"/>
+              <w:bottom w:type="dxa" w:w="80"/>
+              <w:right w:type="dxa" w:w="100"/>
+            </w:tcMar>
+          </w:tcPr>
+          <w:p>
+            <w:r>
+              <w:t xml:space="preserve">How much of each product or service sold and its revenue.</w:t>
+            </w:r>
+          </w:p>
+        </w:tc>
+      </w:tr>
+      <w:tr>
+        <w:tc>
+          <w:tcPr>
+            <w:tcMar>
+              <w:top w:type="dxa" w:w="80"/>
+              <w:left w:type="dxa" w:w="100"/>
+              <w:bottom w:type="dxa" w:w="80"/>
+              <w:right w:type="dxa" w:w="100"/>
+            </w:tcMar>
+          </w:tcPr>
+          <w:p>
+            <w:r>
+              <w:t xml:space="preserve">Sales by Customer</w:t>
+            </w:r>
+          </w:p>
+        </w:tc>
+        <w:tc>
+          <w:tcPr>
+            <w:tcMar>
+              <w:top w:type="dxa" w:w="80"/>
+              <w:left w:type="dxa" w:w="100"/>
+              <w:bottom w:type="dxa" w:w="80"/>
+              <w:right w:type="dxa" w:w="100"/>
+            </w:tcMar>
+          </w:tcPr>
+          <w:p>
+            <w:r>
+              <w:t xml:space="preserve">/reports/sales/by-customer</w:t>
+            </w:r>
+          </w:p>
+        </w:tc>
+        <w:tc>
+          <w:tcPr>
+            <w:tcMar>
+              <w:top w:type="dxa" w:w="80"/>
+              <w:left w:type="dxa" w:w="100"/>
+              <w:bottom w:type="dxa" w:w="80"/>
+              <w:right w:type="dxa" w:w="100"/>
+            </w:tcMar>
+          </w:tcPr>
+          <w:p>
+            <w:r>
+              <w:t xml:space="preserve">Total sales grouped by customer, useful for tracking your best accounts.</w:t>
+            </w:r>
+          </w:p>
+        </w:tc>
+      </w:tr>
+      <w:tr>
+        <w:tc>
+          <w:tcPr>
+            <w:tcMar>
+              <w:top w:type="dxa" w:w="80"/>
+              <w:left w:type="dxa" w:w="100"/>
+              <w:bottom w:type="dxa" w:w="80"/>
+              <w:right w:type="dxa" w:w="100"/>
+            </w:tcMar>
+          </w:tcPr>
+          <w:p>
+            <w:r>
+              <w:t xml:space="preserve">Top Sales</w:t>
+            </w:r>
+          </w:p>
+        </w:tc>
+        <w:tc>
+          <w:tcPr>
+            <w:tcMar>
+              <w:top w:type="dxa" w:w="80"/>
+              <w:left w:type="dxa" w:w="100"/>
+              <w:bottom w:type="dxa" w:w="80"/>
+              <w:right w:type="dxa" w:w="100"/>
+            </w:tcMar>
+          </w:tcPr>
+          <w:p>
+            <w:r>
+              <w:t xml:space="preserve">/reports/sales/top-sales</w:t>
+            </w:r>
+          </w:p>
+        </w:tc>
+        <w:tc>
+          <w:tcPr>
+            <w:tcMar>
+              <w:top w:type="dxa" w:w="80"/>
+              <w:left w:type="dxa" w:w="100"/>
+              <w:bottom w:type="dxa" w:w="80"/>
+              <w:right w:type="dxa" w:w="100"/>
+            </w:tcMar>
+          </w:tcPr>
+          <w:p>
+            <w:r>
+              <w:t xml:space="preserve">Best-selling products ranked by revenue.</w:t>
+            </w:r>
+          </w:p>
+        </w:tc>
+      </w:tr>
+      <w:tr>
+        <w:tc>
+          <w:tcPr>
+            <w:tcMar>
+              <w:top w:type="dxa" w:w="80"/>
+              <w:left w:type="dxa" w:w="100"/>
+              <w:bottom w:type="dxa" w:w="80"/>
+              <w:right w:type="dxa" w:w="100"/>
+            </w:tcMar>
+          </w:tcPr>
+          <w:p>
+            <w:r>
+              <w:t xml:space="preserve">Top Volume</w:t>
+            </w:r>
+          </w:p>
+        </w:tc>
+        <w:tc>
+          <w:tcPr>
+            <w:tcMar>
+              <w:top w:type="dxa" w:w="80"/>
+              <w:left w:type="dxa" w:w="100"/>
+              <w:bottom w:type="dxa" w:w="80"/>
+              <w:right w:type="dxa" w:w="100"/>
+            </w:tcMar>
+          </w:tcPr>
+          <w:p>
+            <w:r>
+              <w:t xml:space="preserve">/reports/sales/top-volume</w:t>
+            </w:r>
+          </w:p>
+        </w:tc>
+        <w:tc>
+          <w:tcPr>
+            <w:tcMar>
+              <w:top w:type="dxa" w:w="80"/>
+              <w:left w:type="dxa" w:w="100"/>
+              <w:bottom w:type="dxa" w:w="80"/>
+              <w:right w:type="dxa" w:w="100"/>
+            </w:tcMar>
+          </w:tcPr>
+          <w:p>
+            <w:r>
+              <w:t xml:space="preserve">Best-selling products ranked by quantity sold.</w:t>
+            </w:r>
+          </w:p>
+        </w:tc>
+      </w:tr>
+      <w:tr>
+        <w:tc>
+          <w:tcPr>
+            <w:tcMar>
+              <w:top w:type="dxa" w:w="80"/>
+              <w:left w:type="dxa" w:w="100"/>
+              <w:bottom w:type="dxa" w:w="80"/>
+              <w:right w:type="dxa" w:w="100"/>
+            </w:tcMar>
+          </w:tcPr>
+          <w:p>
+            <w:r>
+              <w:t xml:space="preserve">Profit Margin</w:t>
+            </w:r>
+          </w:p>
+        </w:tc>
+        <w:tc>
+          <w:tcPr>
+            <w:tcMar>
+              <w:top w:type="dxa" w:w="80"/>
+              <w:left w:type="dxa" w:w="100"/>
+              <w:bottom w:type="dxa" w:w="80"/>
+              <w:right w:type="dxa" w:w="100"/>
+            </w:tcMar>
+          </w:tcPr>
+          <w:p>
+            <w:r>
+              <w:t xml:space="preserve">/reports/sales/profit-margin</w:t>
+            </w:r>
+          </w:p>
+        </w:tc>
+        <w:tc>
+          <w:tcPr>
+            <w:tcMar>
+              <w:top w:type="dxa" w:w="80"/>
+              <w:left w:type="dxa" w:w="100"/>
+              <w:bottom w:type="dxa" w:w="80"/>
+              <w:right w:type="dxa" w:w="100"/>
+            </w:tcMar>
+          </w:tcPr>
+          <w:p>
+            <w:r>
+              <w:t xml:space="preserve">Profit margin per product, comparing cost against selling price.</w:t>
+            </w:r>
+          </w:p>
+        </w:tc>
+      </w:tr>
+      <w:tr>
+        <w:tc>
+          <w:tcPr>
+            <w:tcMar>
+              <w:top w:type="dxa" w:w="80"/>
+              <w:left w:type="dxa" w:w="100"/>
+              <w:bottom w:type="dxa" w:w="80"/>
+              <w:right w:type="dxa" w:w="100"/>
+            </w:tcMar>
+          </w:tcPr>
+          <w:p>
+            <w:r>
+              <w:t xml:space="preserve">Batch Profit</w:t>
+            </w:r>
+          </w:p>
+        </w:tc>
+        <w:tc>
+          <w:tcPr>
+            <w:tcMar>
+              <w:top w:type="dxa" w:w="80"/>
+              <w:left w:type="dxa" w:w="100"/>
+              <w:bottom w:type="dxa" w:w="80"/>
+              <w:right w:type="dxa" w:w="100"/>
+            </w:tcMar>
+          </w:tcPr>
+          <w:p>
+            <w:r>
+              <w:t xml:space="preserve">/reports/sales/batch-profit</w:t>
+            </w:r>
+          </w:p>
+        </w:tc>
+        <w:tc>
+          <w:tcPr>
+            <w:tcMar>
+              <w:top w:type="dxa" w:w="80"/>
+              <w:left w:type="dxa" w:w="100"/>
+              <w:bottom w:type="dxa" w:w="80"/>
+              <w:right w:type="dxa" w:w="100"/>
+            </w:tcMar>
+          </w:tcPr>
+          <w:p>
+            <w:r>
+              <w:t xml:space="preserve">Profit calculated per FIFO cost batch, showing which stock batches were most profitable.</w:t>
+            </w:r>
+          </w:p>
+        </w:tc>
+      </w:tr>
+      <w:tr>
+        <w:tc>
+          <w:tcPr>
+            <w:tcMar>
+              <w:top w:type="dxa" w:w="80"/>
+              <w:left w:type="dxa" w:w="100"/>
+              <w:bottom w:type="dxa" w:w="80"/>
+              <w:right w:type="dxa" w:w="100"/>
+            </w:tcMar>
+          </w:tcPr>
+          <w:p>
+            <w:r>
+              <w:t xml:space="preserve">Discounts</w:t>
+            </w:r>
+          </w:p>
+        </w:tc>
+        <w:tc>
+          <w:tcPr>
+            <w:tcMar>
+              <w:top w:type="dxa" w:w="80"/>
+              <w:left w:type="dxa" w:w="100"/>
+              <w:bottom w:type="dxa" w:w="80"/>
+              <w:right w:type="dxa" w:w="100"/>
+            </w:tcMar>
+          </w:tcPr>
+          <w:p>
+            <w:r>
+              <w:t xml:space="preserve">/reports/sales/discounts</w:t>
+            </w:r>
+          </w:p>
+        </w:tc>
+        <w:tc>
+          <w:tcPr>
+            <w:tcMar>
+              <w:top w:type="dxa" w:w="80"/>
+              <w:left w:type="dxa" w:w="100"/>
+              <w:bottom w:type="dxa" w:w="80"/>
+              <w:right w:type="dxa" w:w="100"/>
+            </w:tcMar>
+          </w:tcPr>
+          <w:p>
+            <w:r>
+              <w:t xml:space="preserve">All discounts given, by cashier, product, or period.</w:t>
+            </w:r>
+          </w:p>
+        </w:tc>
+      </w:tr>
+      <w:tr>
+        <w:tc>
+          <w:tcPr>
+            <w:tcMar>
+              <w:top w:type="dxa" w:w="80"/>
+              <w:left w:type="dxa" w:w="100"/>
+              <w:bottom w:type="dxa" w:w="80"/>
+              <w:right w:type="dxa" w:w="100"/>
+            </w:tcMar>
+          </w:tcPr>
+          <w:p>
+            <w:r>
+              <w:t xml:space="preserve">Split Payments</w:t>
+            </w:r>
+          </w:p>
+        </w:tc>
+        <w:tc>
+          <w:tcPr>
+            <w:tcMar>
+              <w:top w:type="dxa" w:w="80"/>
+              <w:left w:type="dxa" w:w="100"/>
+              <w:bottom w:type="dxa" w:w="80"/>
+              <w:right w:type="dxa" w:w="100"/>
+            </w:tcMar>
+          </w:tcPr>
+          <w:p>
+            <w:r>
+              <w:t xml:space="preserve">/reports/sales/split-payments</w:t>
+            </w:r>
+          </w:p>
+        </w:tc>
+        <w:tc>
+          <w:tcPr>
+            <w:tcMar>
+              <w:top w:type="dxa" w:w="80"/>
+              <w:left w:type="dxa" w:w="100"/>
+              <w:bottom w:type="dxa" w:w="80"/>
+              <w:right w:type="dxa" w:w="100"/>
+            </w:tcMar>
+          </w:tcPr>
+          <w:p>
+            <w:r>
+              <w:t xml:space="preserve">Sales paid using more than one payment method.</w:t>
+            </w:r>
+          </w:p>
+        </w:tc>
+      </w:tr>
+      <w:tr>
+        <w:tc>
+          <w:tcPr>
+            <w:tcMar>
+              <w:top w:type="dxa" w:w="80"/>
+              <w:left w:type="dxa" w:w="100"/>
+              <w:bottom w:type="dxa" w:w="80"/>
+              <w:right w:type="dxa" w:w="100"/>
+            </w:tcMar>
+          </w:tcPr>
+          <w:p>
+            <w:r>
+              <w:t xml:space="preserve">Returns</w:t>
+            </w:r>
+          </w:p>
+        </w:tc>
+        <w:tc>
+          <w:tcPr>
+            <w:tcMar>
+              <w:top w:type="dxa" w:w="80"/>
+              <w:left w:type="dxa" w:w="100"/>
+              <w:bottom w:type="dxa" w:w="80"/>
+              <w:right w:type="dxa" w:w="100"/>
+            </w:tcMar>
+          </w:tcPr>
+          <w:p>
+            <w:r>
+              <w:t xml:space="preserve">/reports/sales/returns</w:t>
+            </w:r>
+          </w:p>
+        </w:tc>
+        <w:tc>
+          <w:tcPr>
+            <w:tcMar>
+              <w:top w:type="dxa" w:w="80"/>
+              <w:left w:type="dxa" w:w="100"/>
+              <w:bottom w:type="dxa" w:w="80"/>
+              <w:right w:type="dxa" w:w="100"/>
+            </w:tcMar>
+          </w:tcPr>
+          <w:p>
+            <w:r>
+              <w:t xml:space="preserve">Merchandise credits and returned items.</w:t>
+            </w:r>
+          </w:p>
+        </w:tc>
+      </w:tr>
+      <w:tr>
+        <w:tc>
+          <w:tcPr>
+            <w:tcMar>
+              <w:top w:type="dxa" w:w="80"/>
+              <w:left w:type="dxa" w:w="100"/>
+              <w:bottom w:type="dxa" w:w="80"/>
+              <w:right w:type="dxa" w:w="100"/>
+            </w:tcMar>
+          </w:tcPr>
+          <w:p>
+            <w:r>
+              <w:t xml:space="preserve">BIR Summary</w:t>
+            </w:r>
+          </w:p>
+        </w:tc>
+        <w:tc>
+          <w:tcPr>
+            <w:tcMar>
+              <w:top w:type="dxa" w:w="80"/>
+              <w:left w:type="dxa" w:w="100"/>
+              <w:bottom w:type="dxa" w:w="80"/>
+              <w:right w:type="dxa" w:w="100"/>
+            </w:tcMar>
+          </w:tcPr>
+          <w:p>
+            <w:r>
+              <w:t xml:space="preserve">/reports/sales/bir-summary</w:t>
+            </w:r>
+          </w:p>
+        </w:tc>
+        <w:tc>
+          <w:tcPr>
+            <w:tcMar>
+              <w:top w:type="dxa" w:w="80"/>
+              <w:left w:type="dxa" w:w="100"/>
+              <w:bottom w:type="dxa" w:w="80"/>
+              <w:right w:type="dxa" w:w="100"/>
+            </w:tcMar>
+          </w:tcPr>
+          <w:p>
+            <w:r>
+              <w:t xml:space="preserve">Official BIR-format summary of sales invoice numbers and totals for tax filing.</w:t>
+            </w:r>
+          </w:p>
+        </w:tc>
+      </w:tr>
+      <w:tr>
+        <w:tc>
+          <w:tcPr>
+            <w:tcMar>
+              <w:top w:type="dxa" w:w="80"/>
+              <w:left w:type="dxa" w:w="100"/>
+              <w:bottom w:type="dxa" w:w="80"/>
+              <w:right w:type="dxa" w:w="100"/>
+            </w:tcMar>
+          </w:tcPr>
+          <w:p>
+            <w:r>
+              <w:t xml:space="preserve">Purchases Summary</w:t>
+            </w:r>
+          </w:p>
+        </w:tc>
+        <w:tc>
+          <w:tcPr>
+            <w:tcMar>
+              <w:top w:type="dxa" w:w="80"/>
+              <w:left w:type="dxa" w:w="100"/>
+              <w:bottom w:type="dxa" w:w="80"/>
+              <w:right w:type="dxa" w:w="100"/>
+            </w:tcMar>
+          </w:tcPr>
+          <w:p>
+            <w:r>
+              <w:t xml:space="preserve">/reports/purchases/summary</w:t>
+            </w:r>
+          </w:p>
+        </w:tc>
+        <w:tc>
+          <w:tcPr>
+            <w:tcMar>
+              <w:top w:type="dxa" w:w="80"/>
+              <w:left w:type="dxa" w:w="100"/>
+              <w:bottom w:type="dxa" w:w="80"/>
+              <w:right w:type="dxa" w:w="100"/>
+            </w:tcMar>
+          </w:tcPr>
+          <w:p>
+            <w:r>
+              <w:t xml:space="preserve">Total purchase spend for a chosen period.</w:t>
+            </w:r>
+          </w:p>
+        </w:tc>
+      </w:tr>
+      <w:tr>
+        <w:tc>
+          <w:tcPr>
+            <w:tcMar>
+              <w:top w:type="dxa" w:w="80"/>
+              <w:left w:type="dxa" w:w="100"/>
+              <w:bottom w:type="dxa" w:w="80"/>
+              <w:right w:type="dxa" w:w="100"/>
+            </w:tcMar>
+          </w:tcPr>
+          <w:p>
+            <w:r>
+              <w:t xml:space="preserve">Purchases by Supplier</w:t>
+            </w:r>
+          </w:p>
+        </w:tc>
+        <w:tc>
+          <w:tcPr>
+            <w:tcMar>
+              <w:top w:type="dxa" w:w="80"/>
+              <w:left w:type="dxa" w:w="100"/>
+              <w:bottom w:type="dxa" w:w="80"/>
+              <w:right w:type="dxa" w:w="100"/>
+            </w:tcMar>
+          </w:tcPr>
+          <w:p>
+            <w:r>
+              <w:t xml:space="preserve">/reports/purchases/by-supplier</w:t>
+            </w:r>
+          </w:p>
+        </w:tc>
+        <w:tc>
+          <w:tcPr>
+            <w:tcMar>
+              <w:top w:type="dxa" w:w="80"/>
+              <w:left w:type="dxa" w:w="100"/>
+              <w:bottom w:type="dxa" w:w="80"/>
+              <w:right w:type="dxa" w:w="100"/>
+            </w:tcMar>
+          </w:tcPr>
+          <w:p>
+            <w:r>
+              <w:t xml:space="preserve">Purchases grouped by supplier, showing who you buy the most from.</w:t>
+            </w:r>
+          </w:p>
+        </w:tc>
+      </w:tr>
+      <w:tr>
+        <w:tc>
+          <w:tcPr>
+            <w:tcMar>
+              <w:top w:type="dxa" w:w="80"/>
+              <w:left w:type="dxa" w:w="100"/>
+              <w:bottom w:type="dxa" w:w="80"/>
+              <w:right w:type="dxa" w:w="100"/>
+            </w:tcMar>
+          </w:tcPr>
+          <w:p>
+            <w:r>
+              <w:t xml:space="preserve">Purchases by Product</w:t>
+            </w:r>
+          </w:p>
+        </w:tc>
+        <w:tc>
+          <w:tcPr>
+            <w:tcMar>
+              <w:top w:type="dxa" w:w="80"/>
+              <w:left w:type="dxa" w:w="100"/>
+              <w:bottom w:type="dxa" w:w="80"/>
+              <w:right w:type="dxa" w:w="100"/>
+            </w:tcMar>
+          </w:tcPr>
+          <w:p>
+            <w:r>
+              <w:t xml:space="preserve">/reports/purchases/by-product</w:t>
+            </w:r>
+          </w:p>
+        </w:tc>
+        <w:tc>
+          <w:tcPr>
+            <w:tcMar>
+              <w:top w:type="dxa" w:w="80"/>
+              <w:left w:type="dxa" w:w="100"/>
+              <w:bottom w:type="dxa" w:w="80"/>
+              <w:right w:type="dxa" w:w="100"/>
+            </w:tcMar>
+          </w:tcPr>
+          <w:p>
+            <w:r>
+              <w:t xml:space="preserve">Purchases grouped by product, showing what you restock most often.</w:t>
+            </w:r>
+          </w:p>
+        </w:tc>
+      </w:tr>
+      <w:tr>
+        <w:tc>
+          <w:tcPr>
+            <w:tcMar>
+              <w:top w:type="dxa" w:w="80"/>
+              <w:left w:type="dxa" w:w="100"/>
+              <w:bottom w:type="dxa" w:w="80"/>
+              <w:right w:type="dxa" w:w="100"/>
+            </w:tcMar>
+          </w:tcPr>
+          <w:p>
+            <w:r>
+              <w:t xml:space="preserve">Inventory</w:t>
+            </w:r>
+          </w:p>
+        </w:tc>
+        <w:tc>
+          <w:tcPr>
+            <w:tcMar>
+              <w:top w:type="dxa" w:w="80"/>
+              <w:left w:type="dxa" w:w="100"/>
+              <w:bottom w:type="dxa" w:w="80"/>
+              <w:right w:type="dxa" w:w="100"/>
+            </w:tcMar>
+          </w:tcPr>
+          <w:p>
+            <w:r>
+              <w:t xml:space="preserve">/reports/inventory</w:t>
+            </w:r>
+          </w:p>
+        </w:tc>
+        <w:tc>
+          <w:tcPr>
+            <w:tcMar>
+              <w:top w:type="dxa" w:w="80"/>
+              <w:left w:type="dxa" w:w="100"/>
+              <w:bottom w:type="dxa" w:w="80"/>
+              <w:right w:type="dxa" w:w="100"/>
+            </w:tcMar>
+          </w:tcPr>
+          <w:p>
+            <w:r>
+              <w:t xml:space="preserve">A full snapshot of current stock levels across all products.</w:t>
+            </w:r>
+          </w:p>
+        </w:tc>
+      </w:tr>
+      <w:tr>
+        <w:tc>
+          <w:tcPr>
+            <w:tcMar>
+              <w:top w:type="dxa" w:w="80"/>
+              <w:left w:type="dxa" w:w="100"/>
+              <w:bottom w:type="dxa" w:w="80"/>
+              <w:right w:type="dxa" w:w="100"/>
+            </w:tcMar>
+          </w:tcPr>
+          <w:p>
+            <w:r>
+              <w:t xml:space="preserve">Low Stock</w:t>
+            </w:r>
+          </w:p>
+        </w:tc>
+        <w:tc>
+          <w:tcPr>
+            <w:tcMar>
+              <w:top w:type="dxa" w:w="80"/>
+              <w:left w:type="dxa" w:w="100"/>
+              <w:bottom w:type="dxa" w:w="80"/>
+              <w:right w:type="dxa" w:w="100"/>
+            </w:tcMar>
+          </w:tcPr>
+          <w:p>
+            <w:r>
+              <w:t xml:space="preserve">/reports/low-stock</w:t>
+            </w:r>
+          </w:p>
+        </w:tc>
+        <w:tc>
+          <w:tcPr>
+            <w:tcMar>
+              <w:top w:type="dxa" w:w="80"/>
+              <w:left w:type="dxa" w:w="100"/>
+              <w:bottom w:type="dxa" w:w="80"/>
+              <w:right w:type="dxa" w:w="100"/>
+            </w:tcMar>
+          </w:tcPr>
+          <w:p>
+            <w:r>
+              <w:t xml:space="preserve">Products that have fallen below their reorder point and need restocking.</w:t>
+            </w:r>
+          </w:p>
+        </w:tc>
+      </w:tr>
+      <w:tr>
+        <w:tc>
+          <w:tcPr>
+            <w:tcMar>
+              <w:top w:type="dxa" w:w="80"/>
+              <w:left w:type="dxa" w:w="100"/>
+              <w:bottom w:type="dxa" w:w="80"/>
+              <w:right w:type="dxa" w:w="100"/>
+            </w:tcMar>
+          </w:tcPr>
+          <w:p>
+            <w:r>
+              <w:t xml:space="preserve">Expiring Soon</w:t>
+            </w:r>
+          </w:p>
+        </w:tc>
+        <w:tc>
+          <w:tcPr>
+            <w:tcMar>
+              <w:top w:type="dxa" w:w="80"/>
+              <w:left w:type="dxa" w:w="100"/>
+              <w:bottom w:type="dxa" w:w="80"/>
+              <w:right w:type="dxa" w:w="100"/>
+            </w:tcMar>
+          </w:tcPr>
+          <w:p>
+            <w:r>
+              <w:t xml:space="preserve">/reports/expiring-soon</w:t>
+            </w:r>
+          </w:p>
+        </w:tc>
+        <w:tc>
+          <w:tcPr>
+            <w:tcMar>
+              <w:top w:type="dxa" w:w="80"/>
+              <w:left w:type="dxa" w:w="100"/>
+              <w:bottom w:type="dxa" w:w="80"/>
+              <w:right w:type="dxa" w:w="100"/>
+            </w:tcMar>
+          </w:tcPr>
+          <w:p>
+            <w:r>
+              <w:t xml:space="preserve">Products approaching their expiration date, so they can be sold or pulled first.</w:t>
+            </w:r>
+          </w:p>
+        </w:tc>
+      </w:tr>
+      <w:tr>
+        <w:tc>
+          <w:tcPr>
+            <w:tcMar>
+              <w:top w:type="dxa" w:w="80"/>
+              <w:left w:type="dxa" w:w="100"/>
+              <w:bottom w:type="dxa" w:w="80"/>
+              <w:right w:type="dxa" w:w="100"/>
+            </w:tcMar>
+          </w:tcPr>
+          <w:p>
+            <w:r>
+              <w:t xml:space="preserve">Cost vs Retail</w:t>
+            </w:r>
+          </w:p>
+        </w:tc>
+        <w:tc>
+          <w:tcPr>
+            <w:tcMar>
+              <w:top w:type="dxa" w:w="80"/>
+              <w:left w:type="dxa" w:w="100"/>
+              <w:bottom w:type="dxa" w:w="80"/>
+              <w:right w:type="dxa" w:w="100"/>
+            </w:tcMar>
+          </w:tcPr>
+          <w:p>
+            <w:r>
+              <w:t xml:space="preserve">/reports/cost-vs-retail</w:t>
+            </w:r>
+          </w:p>
+        </w:tc>
+        <w:tc>
+          <w:tcPr>
+            <w:tcMar>
+              <w:top w:type="dxa" w:w="80"/>
+              <w:left w:type="dxa" w:w="100"/>
+              <w:bottom w:type="dxa" w:w="80"/>
+              <w:right w:type="dxa" w:w="100"/>
+            </w:tcMar>
+          </w:tcPr>
+          <w:p>
+            <w:r>
+              <w:t xml:space="preserve">Side-by-side comparison of product cost and retail price to check markups.</w:t>
+            </w:r>
+          </w:p>
+        </w:tc>
+      </w:tr>
+      <w:tr>
+        <w:tc>
+          <w:tcPr>
+            <w:tcMar>
+              <w:top w:type="dxa" w:w="80"/>
+              <w:left w:type="dxa" w:w="100"/>
+              <w:bottom w:type="dxa" w:w="80"/>
+              <w:right w:type="dxa" w:w="100"/>
+            </w:tcMar>
+          </w:tcPr>
+          <w:p>
+            <w:r>
+              <w:t xml:space="preserve">Movements</w:t>
+            </w:r>
+          </w:p>
+        </w:tc>
+        <w:tc>
+          <w:tcPr>
+            <w:tcMar>
+              <w:top w:type="dxa" w:w="80"/>
+              <w:left w:type="dxa" w:w="100"/>
+              <w:bottom w:type="dxa" w:w="80"/>
+              <w:right w:type="dxa" w:w="100"/>
+            </w:tcMar>
+          </w:tcPr>
+          <w:p>
+            <w:r>
+              <w:t xml:space="preserve">/reports/movements</w:t>
+            </w:r>
+          </w:p>
+        </w:tc>
+        <w:tc>
+          <w:tcPr>
+            <w:tcMar>
+              <w:top w:type="dxa" w:w="80"/>
+              <w:left w:type="dxa" w:w="100"/>
+              <w:bottom w:type="dxa" w:w="80"/>
+              <w:right w:type="dxa" w:w="100"/>
+            </w:tcMar>
+          </w:tcPr>
+          <w:p>
+            <w:r>
+              <w:t xml:space="preserve">Full log of every stock movement — sales, purchases, transfers, and adjustments.</w:t>
+            </w:r>
+          </w:p>
+        </w:tc>
+      </w:tr>
+      <w:tr>
+        <w:tc>
+          <w:tcPr>
+            <w:tcMar>
+              <w:top w:type="dxa" w:w="80"/>
+              <w:left w:type="dxa" w:w="100"/>
+              <w:bottom w:type="dxa" w:w="80"/>
+              <w:right w:type="dxa" w:w="100"/>
+            </w:tcMar>
+          </w:tcPr>
+          <w:p>
+            <w:r>
+              <w:t xml:space="preserve">Adjustments</w:t>
+            </w:r>
+          </w:p>
+        </w:tc>
+        <w:tc>
+          <w:tcPr>
+            <w:tcMar>
+              <w:top w:type="dxa" w:w="80"/>
+              <w:left w:type="dxa" w:w="100"/>
+              <w:bottom w:type="dxa" w:w="80"/>
+              <w:right w:type="dxa" w:w="100"/>
+            </w:tcMar>
+          </w:tcPr>
+          <w:p>
+            <w:r>
+              <w:t xml:space="preserve">/reports/adjustments</w:t>
+            </w:r>
+          </w:p>
+        </w:tc>
+        <w:tc>
+          <w:tcPr>
+            <w:tcMar>
+              <w:top w:type="dxa" w:w="80"/>
+              <w:left w:type="dxa" w:w="100"/>
+              <w:bottom w:type="dxa" w:w="80"/>
+              <w:right w:type="dxa" w:w="100"/>
+            </w:tcMar>
+          </w:tcPr>
+          <w:p>
+            <w:r>
+              <w:t xml:space="preserve">Manual stock adjustments only, with reasons and approval status.</w:t>
+            </w:r>
+          </w:p>
+        </w:tc>
+      </w:tr>
+      <w:tr>
+        <w:tc>
+          <w:tcPr>
+            <w:tcMar>
+              <w:top w:type="dxa" w:w="80"/>
+              <w:left w:type="dxa" w:w="100"/>
+              <w:bottom w:type="dxa" w:w="80"/>
+              <w:right w:type="dxa" w:w="100"/>
+            </w:tcMar>
+          </w:tcPr>
+          <w:p>
+            <w:r>
+              <w:t xml:space="preserve">Velocity</w:t>
+            </w:r>
+          </w:p>
+        </w:tc>
+        <w:tc>
+          <w:tcPr>
+            <w:tcMar>
+              <w:top w:type="dxa" w:w="80"/>
+              <w:left w:type="dxa" w:w="100"/>
+              <w:bottom w:type="dxa" w:w="80"/>
+              <w:right w:type="dxa" w:w="100"/>
+            </w:tcMar>
+          </w:tcPr>
+          <w:p>
+            <w:r>
+              <w:t xml:space="preserve">/reports/velocity</w:t>
+            </w:r>
+          </w:p>
+        </w:tc>
+        <w:tc>
+          <w:tcPr>
+            <w:tcMar>
+              <w:top w:type="dxa" w:w="80"/>
+              <w:left w:type="dxa" w:w="100"/>
+              <w:bottom w:type="dxa" w:w="80"/>
+              <w:right w:type="dxa" w:w="100"/>
+            </w:tcMar>
+          </w:tcPr>
+          <w:p>
+            <w:r>
+              <w:t xml:space="preserve">How fast each product sells, useful for planning reorder quantities.</w:t>
+            </w:r>
+          </w:p>
+        </w:tc>
+      </w:tr>
+      <w:tr>
+        <w:tc>
+          <w:tcPr>
+            <w:tcMar>
+              <w:top w:type="dxa" w:w="80"/>
+              <w:left w:type="dxa" w:w="100"/>
+              <w:bottom w:type="dxa" w:w="80"/>
+              <w:right w:type="dxa" w:w="100"/>
+            </w:tcMar>
+          </w:tcPr>
+          <w:p>
+            <w:r>
+              <w:t xml:space="preserve">Membership</w:t>
+            </w:r>
+          </w:p>
+        </w:tc>
+        <w:tc>
+          <w:tcPr>
+            <w:tcMar>
+              <w:top w:type="dxa" w:w="80"/>
+              <w:left w:type="dxa" w:w="100"/>
+              <w:bottom w:type="dxa" w:w="80"/>
+              <w:right w:type="dxa" w:w="100"/>
+            </w:tcMar>
+          </w:tcPr>
+          <w:p>
+            <w:r>
+              <w:t xml:space="preserve">/reports/membership</w:t>
+            </w:r>
+          </w:p>
+        </w:tc>
+        <w:tc>
+          <w:tcPr>
+            <w:tcMar>
+              <w:top w:type="dxa" w:w="80"/>
+              <w:left w:type="dxa" w:w="100"/>
+              <w:bottom w:type="dxa" w:w="80"/>
+              <w:right w:type="dxa" w:w="100"/>
+            </w:tcMar>
+          </w:tcPr>
+          <w:p>
+            <w:r>
+              <w:t xml:space="preserve">Membership activations and renewals, with amount, payment method, cashier, and how long each membership runs.</w:t>
+            </w:r>
+          </w:p>
+        </w:tc>
+      </w:tr>
+      <w:tr>
+        <w:tc>
+          <w:tcPr>
+            <w:tcMar>
+              <w:top w:type="dxa" w:w="80"/>
+              <w:left w:type="dxa" w:w="100"/>
+              <w:bottom w:type="dxa" w:w="80"/>
+              <w:right w:type="dxa" w:w="100"/>
+            </w:tcMar>
+          </w:tcPr>
+          <w:p>
+            <w:r>
+              <w:t xml:space="preserve">Fiscal Year</w:t>
+            </w:r>
+          </w:p>
+        </w:tc>
+        <w:tc>
+          <w:tcPr>
+            <w:tcMar>
+              <w:top w:type="dxa" w:w="80"/>
+              <w:left w:type="dxa" w:w="100"/>
+              <w:bottom w:type="dxa" w:w="80"/>
+              <w:right w:type="dxa" w:w="100"/>
+            </w:tcMar>
+          </w:tcPr>
+          <w:p>
+            <w:r>
+              <w:t xml:space="preserve">/reports/fiscal-year</w:t>
+            </w:r>
+          </w:p>
+        </w:tc>
+        <w:tc>
+          <w:tcPr>
+            <w:tcMar>
+              <w:top w:type="dxa" w:w="80"/>
+              <w:left w:type="dxa" w:w="100"/>
+              <w:bottom w:type="dxa" w:w="80"/>
+              <w:right w:type="dxa" w:w="100"/>
+            </w:tcMar>
+          </w:tcPr>
+          <w:p>
+            <w:r>
+              <w:t xml:space="preserve">Summary figures aligned to your store's configured fiscal year.</w:t>
+            </w:r>
+          </w:p>
+        </w:tc>
+      </w:tr>
+    </w:tbl>
+    <w:p/>
     <w:p>
       <w:pPr>
         <w:spacing w:after="40" w:before="120"/>
@@ -6101,187 +5985,41 @@
           <w:i/>
           <w:iCs/>
         </w:rPr>
-        <w:t xml:space="preserve">Figure 32: POS setup</w:t>
-      </w:r>
-    </w:p>
-    <w:p>
-      <w:pPr>
-        <w:spacing w:after="160"/>
-      </w:pPr>
-      <w:r>
-        <w:t xml:space="preserve">The General tab also holds the Membership settings, which control what customers pay for a loyalty card and how long that card stays valid. Cashiers cannot collect a membership fee until these are set.</w:t>
-      </w:r>
-    </w:p>
-    <w:p>
-      <w:pPr>
-        <w:pStyle w:val="ListParagraph"/>
-        <w:numPr>
-          <w:ilvl w:val="0"/>
-          <w:numId w:val="2"/>
-        </w:numPr>
-        <w:spacing w:after="80"/>
-      </w:pPr>
-      <w:r>
-        <w:t xml:space="preserve">Go to Settings → POS Setup and open the "General" tab.</w:t>
-      </w:r>
-    </w:p>
-    <w:p>
-      <w:pPr>
-        <w:pStyle w:val="ListParagraph"/>
-        <w:numPr>
-          <w:ilvl w:val="0"/>
-          <w:numId w:val="2"/>
-        </w:numPr>
-        <w:spacing w:after="80"/>
-      </w:pPr>
-      <w:r>
-        <w:t xml:space="preserve">Set "Membership Fee (₱)" — the amount charged to activate or renew a customer's loyalty card.</w:t>
-      </w:r>
-    </w:p>
-    <w:p>
-      <w:pPr>
-        <w:pStyle w:val="ListParagraph"/>
-        <w:numPr>
-          <w:ilvl w:val="0"/>
-          <w:numId w:val="2"/>
-        </w:numPr>
-        <w:spacing w:after="80"/>
-      </w:pPr>
-      <w:r>
-        <w:t xml:space="preserve">Set "Membership Duration (months)" — how long a paid membership lasts, counted from the day it is paid. The default is 12 months.</w:t>
-      </w:r>
-    </w:p>
-    <w:p>
-      <w:pPr>
-        <w:pStyle w:val="ListParagraph"/>
-        <w:numPr>
-          <w:ilvl w:val="0"/>
-          <w:numId w:val="2"/>
-        </w:numPr>
-        <w:spacing w:after="80"/>
-      </w:pPr>
-      <w:r>
-        <w:t xml:space="preserve">Click "Save Settings" at the top of the page.</w:t>
-      </w:r>
-    </w:p>
-    <w:p>
-      <w:pPr>
-        <w:shd w:fill="F8D0D0" w:color="auto" w:val="clear"/>
-        <w:spacing w:after="120" w:before="120"/>
-      </w:pPr>
-      <w:r>
-        <w:t xml:space="preserve">[SCREENSHOT MISSING: settings-membership]</w:t>
-      </w:r>
-    </w:p>
-    <w:tbl>
-      <w:tblPr>
-        <w:tblW w:type="pct" w:w="100%"/>
-        <w:tblBorders>
-          <w:top w:val="single" w:color="999999" w:sz="4"/>
-          <w:left w:val="single" w:color="999999" w:sz="4"/>
-          <w:bottom w:val="single" w:color="999999" w:sz="4"/>
-          <w:right w:val="single" w:color="999999" w:sz="4"/>
-          <w:insideH w:val="single" w:color="auto" w:sz="4"/>
-          <w:insideV w:val="single" w:color="auto" w:sz="4"/>
-        </w:tblBorders>
-      </w:tblPr>
-      <w:tblGrid>
-        <w:gridCol w:w="100"/>
-      </w:tblGrid>
-      <w:tr>
-        <w:tc>
-          <w:tcPr>
-            <w:shd w:fill="FFF3C4" w:color="auto" w:val="clear"/>
-            <w:tcMar>
-              <w:top w:type="dxa" w:w="100"/>
-              <w:left w:type="dxa" w:w="150"/>
-              <w:bottom w:type="dxa" w:w="100"/>
-              <w:right w:type="dxa" w:w="150"/>
-            </w:tcMar>
-          </w:tcPr>
-          <w:p>
-            <w:r>
-              <w:rPr>
-                <w:b/>
-                <w:bCs/>
-              </w:rPr>
-              <w:t xml:space="preserve">Tip: </w:t>
-            </w:r>
-            <w:r>
-              <w:t xml:space="preserve">Leaving the membership fee at ₱0.00 stops cashiers from selling memberships altogether — the payment dialog at the POS refuses to confirm and points back to this tab. Set a real amount before the store starts offering memberships.</w:t>
-            </w:r>
-          </w:p>
-        </w:tc>
-      </w:tr>
-    </w:tbl>
-    <w:p/>
+        <w:t xml:space="preserve">Figure 32: Membership report</w:t>
+      </w:r>
+    </w:p>
+    <w:p>
+      <w:pPr>
+        <w:pStyle w:val="Heading1"/>
+        <w:pageBreakBefore/>
+      </w:pPr>
+      <w:r>
+        <w:t xml:space="preserve">Chapter 9: Settings &amp; Users</w:t>
+      </w:r>
+    </w:p>
+    <w:p>
+      <w:pPr>
+        <w:spacing w:after="200"/>
+      </w:pPr>
+      <w:r>
+        <w:t xml:space="preserve">This chapter covers store-wide configuration — POS terminals, tax rates, and general settings — plus managing the user accounts allowed to log in to Verdix. These pages are for admins only and change how the whole system behaves, so treat them carefully.</w:t>
+      </w:r>
+    </w:p>
     <w:p>
       <w:pPr>
         <w:pStyle w:val="Heading2"/>
         <w:spacing w:before="200"/>
       </w:pPr>
       <w:r>
-        <w:t xml:space="preserve">Managing POS terminals</w:t>
-      </w:r>
-    </w:p>
-    <w:p>
-      <w:pPr>
-        <w:spacing w:after="160"/>
-      </w:pPr>
-      <w:r>
-        <w:t xml:space="preserve">Each physical checkout counter in your store is registered as a terminal. This lets Verdix track which terminal a sale happened on and which warehouse it draws stock from.</w:t>
-      </w:r>
-    </w:p>
-    <w:p>
-      <w:pPr>
-        <w:pStyle w:val="ListParagraph"/>
-        <w:numPr>
-          <w:ilvl w:val="0"/>
-          <w:numId w:val="2"/>
-        </w:numPr>
-        <w:spacing w:after="80"/>
-      </w:pPr>
-      <w:r>
-        <w:t xml:space="preserve">Go to Settings → POS Terminals.</w:t>
-      </w:r>
-    </w:p>
-    <w:p>
-      <w:pPr>
-        <w:pStyle w:val="ListParagraph"/>
-        <w:numPr>
-          <w:ilvl w:val="0"/>
-          <w:numId w:val="2"/>
-        </w:numPr>
-        <w:spacing w:after="80"/>
-      </w:pPr>
-      <w:r>
-        <w:t xml:space="preserve">Click the button to add a new terminal and give it a description and warehouse.</w:t>
-      </w:r>
-    </w:p>
-    <w:p>
-      <w:pPr>
-        <w:pStyle w:val="ListParagraph"/>
-        <w:numPr>
-          <w:ilvl w:val="0"/>
-          <w:numId w:val="2"/>
-        </w:numPr>
-        <w:spacing w:after="80"/>
-      </w:pPr>
-      <w:r>
-        <w:t xml:space="preserve">Use the edit action on an existing terminal card to change its details, or the delete action to remove a terminal that is no longer in use.</w:t>
-      </w:r>
-    </w:p>
-    <w:p>
-      <w:pPr>
-        <w:pStyle w:val="ListParagraph"/>
-        <w:numPr>
-          <w:ilvl w:val="0"/>
-          <w:numId w:val="2"/>
-        </w:numPr>
-        <w:spacing w:after="80"/>
-      </w:pPr>
-      <w:r>
-        <w:t xml:space="preserve">If a terminal shows a connection problem, use "Reset Connection" to clear the current link before reconnecting.</w:t>
+        <w:t xml:space="preserve">The Settings hub</w:t>
+      </w:r>
+    </w:p>
+    <w:p>
+      <w:pPr>
+        <w:spacing w:after="160"/>
+      </w:pPr>
+      <w:r>
+        <w:t xml:space="preserve">Settings is organized into tiles, each opening a focused settings area: System Preferences, Notifications, Appearance, Data Management, POS Setup, Tax Rates, Pricing Configuration, Cache &amp; Refresh, and External API Integration.</w:t>
       </w:r>
     </w:p>
     <w:p>
@@ -6340,7 +6078,15 @@
           <w:i/>
           <w:iCs/>
         </w:rPr>
-        <w:t xml:space="preserve">Figure 33: POS terminals</w:t>
+        <w:t xml:space="preserve">Figure 33: Settings</w:t>
+      </w:r>
+    </w:p>
+    <w:p>
+      <w:pPr>
+        <w:spacing w:after="160"/>
+      </w:pPr>
+      <w:r>
+        <w:t xml:space="preserve">Click any tile to open that settings area. The two most commonly used areas for day-to-day store operation — POS Setup and Tax Rates — are covered in more detail below.</w:t>
       </w:r>
     </w:p>
     <w:p>
@@ -6349,54 +6095,54 @@
         <w:spacing w:before="200"/>
       </w:pPr>
       <w:r>
-        <w:t xml:space="preserve">Tax rates</w:t>
-      </w:r>
-    </w:p>
-    <w:p>
-      <w:pPr>
-        <w:spacing w:after="160"/>
-      </w:pPr>
-      <w:r>
-        <w:t xml:space="preserve">The Tax Rates page manages the VAT and other tax rates applied to sales, plus your store's VAT registration type, which controls whether receipts print "VAT REG TIN" or "NON-VAT REG TIN" in the header.</w:t>
-      </w:r>
-    </w:p>
-    <w:p>
-      <w:pPr>
-        <w:pStyle w:val="ListParagraph"/>
-        <w:numPr>
-          <w:ilvl w:val="0"/>
-          <w:numId w:val="2"/>
-        </w:numPr>
-        <w:spacing w:after="80"/>
-      </w:pPr>
-      <w:r>
-        <w:t xml:space="preserve">Go to Settings → Tax Rates. If your store requires authentication for this page, enter admin credentials when prompted.</w:t>
-      </w:r>
-    </w:p>
-    <w:p>
-      <w:pPr>
-        <w:pStyle w:val="ListParagraph"/>
-        <w:numPr>
-          <w:ilvl w:val="0"/>
-          <w:numId w:val="2"/>
-        </w:numPr>
-        <w:spacing w:after="80"/>
-      </w:pPr>
-      <w:r>
-        <w:t xml:space="preserve">Click the "Add Tax Rate" button, or use the edit action on an existing rate.</w:t>
-      </w:r>
-    </w:p>
-    <w:p>
-      <w:pPr>
-        <w:pStyle w:val="ListParagraph"/>
-        <w:numPr>
-          <w:ilvl w:val="0"/>
-          <w:numId w:val="2"/>
-        </w:numPr>
-        <w:spacing w:after="80"/>
-      </w:pPr>
-      <w:r>
-        <w:t xml:space="preserve">Set the "Registration Type" to "VAT Registered" or "Non-VAT Registered" as applicable to your store.</w:t>
+        <w:t xml:space="preserve">POS setup</w:t>
+      </w:r>
+    </w:p>
+    <w:p>
+      <w:pPr>
+        <w:spacing w:after="160"/>
+      </w:pPr>
+      <w:r>
+        <w:t xml:space="preserve">POS Setup configures how the checkout counter behaves. It is organized into tabs: Business (store name, logo, address), General (display and behavior options), Security, Confirmations (which actions require an extra confirmation step), BIR (Philippine tax compliance settings), and Data.</w:t>
+      </w:r>
+    </w:p>
+    <w:p>
+      <w:pPr>
+        <w:pStyle w:val="ListParagraph"/>
+        <w:numPr>
+          <w:ilvl w:val="0"/>
+          <w:numId w:val="2"/>
+        </w:numPr>
+        <w:spacing w:after="80"/>
+      </w:pPr>
+      <w:r>
+        <w:t xml:space="preserve">Go to Settings → POS Setup.</w:t>
+      </w:r>
+    </w:p>
+    <w:p>
+      <w:pPr>
+        <w:pStyle w:val="ListParagraph"/>
+        <w:numPr>
+          <w:ilvl w:val="0"/>
+          <w:numId w:val="2"/>
+        </w:numPr>
+        <w:spacing w:after="80"/>
+      </w:pPr>
+      <w:r>
+        <w:t xml:space="preserve">Choose the tab for the setting you need to change.</w:t>
+      </w:r>
+    </w:p>
+    <w:p>
+      <w:pPr>
+        <w:pStyle w:val="ListParagraph"/>
+        <w:numPr>
+          <w:ilvl w:val="0"/>
+          <w:numId w:val="2"/>
+        </w:numPr>
+        <w:spacing w:after="80"/>
+      </w:pPr>
+      <w:r>
+        <w:t xml:space="preserve">Make your changes, then click "Save Settings" at the top of the page.</w:t>
       </w:r>
     </w:p>
     <w:p>
@@ -6455,131 +6201,67 @@
           <w:i/>
           <w:iCs/>
         </w:rPr>
-        <w:t xml:space="preserve">Figure 34: Tax rates</w:t>
-      </w:r>
-    </w:p>
-    <w:tbl>
-      <w:tblPr>
-        <w:tblW w:type="pct" w:w="100%"/>
-        <w:tblBorders>
-          <w:top w:val="single" w:color="999999" w:sz="4"/>
-          <w:left w:val="single" w:color="999999" w:sz="4"/>
-          <w:bottom w:val="single" w:color="999999" w:sz="4"/>
-          <w:right w:val="single" w:color="999999" w:sz="4"/>
-          <w:insideH w:val="single" w:color="auto" w:sz="4"/>
-          <w:insideV w:val="single" w:color="auto" w:sz="4"/>
-        </w:tblBorders>
-      </w:tblPr>
-      <w:tblGrid>
-        <w:gridCol w:w="100"/>
-      </w:tblGrid>
-      <w:tr>
-        <w:tc>
-          <w:tcPr>
-            <w:shd w:fill="F8D0D0" w:color="auto" w:val="clear"/>
-            <w:tcMar>
-              <w:top w:type="dxa" w:w="100"/>
-              <w:left w:type="dxa" w:w="150"/>
-              <w:bottom w:type="dxa" w:w="100"/>
-              <w:right w:type="dxa" w:w="150"/>
-            </w:tcMar>
-          </w:tcPr>
-          <w:p>
-            <w:r>
-              <w:rPr>
-                <w:b/>
-                <w:bCs/>
-              </w:rPr>
-              <w:t xml:space="preserve">Warning: </w:t>
-            </w:r>
-            <w:r>
-              <w:t xml:space="preserve">Sales invoice (SI) numbers printed on receipts must be sequential with no gaps and no duplicates — this is a legal requirement for Philippine BIR tax filing. Do not attempt to renumber, delete, or reuse an invoice number; the system enforces sequential numbering automatically, so changes here should only ever add new tax rates, not alter existing invoice history.</w:t>
-            </w:r>
-          </w:p>
-        </w:tc>
-      </w:tr>
-    </w:tbl>
-    <w:p/>
-    <w:p>
-      <w:pPr>
-        <w:pStyle w:val="Heading2"/>
-        <w:spacing w:before="200"/>
-      </w:pPr>
-      <w:r>
-        <w:t xml:space="preserve">User management</w:t>
-      </w:r>
-    </w:p>
-    <w:p>
-      <w:pPr>
-        <w:spacing w:after="160"/>
-      </w:pPr>
-      <w:r>
-        <w:t xml:space="preserve">User Management controls who can log in to Verdix, what permissions they have, and lets you review an activity log of what every user has done across the system.</w:t>
-      </w:r>
-    </w:p>
-    <w:p>
-      <w:pPr>
-        <w:pStyle w:val="ListParagraph"/>
-        <w:numPr>
-          <w:ilvl w:val="0"/>
-          <w:numId w:val="2"/>
-        </w:numPr>
-        <w:spacing w:after="80"/>
-      </w:pPr>
-      <w:r>
-        <w:t xml:space="preserve">Go to User Management.</w:t>
-      </w:r>
-    </w:p>
-    <w:p>
-      <w:pPr>
-        <w:pStyle w:val="ListParagraph"/>
-        <w:numPr>
-          <w:ilvl w:val="0"/>
-          <w:numId w:val="2"/>
-        </w:numPr>
-        <w:spacing w:after="80"/>
-      </w:pPr>
-      <w:r>
-        <w:t xml:space="preserve">Click the "Add User" button, filling in their name, username, password, and user type.</w:t>
-      </w:r>
-    </w:p>
-    <w:p>
-      <w:pPr>
-        <w:pStyle w:val="ListParagraph"/>
-        <w:numPr>
-          <w:ilvl w:val="0"/>
-          <w:numId w:val="2"/>
-        </w:numPr>
-        <w:spacing w:after="80"/>
-      </w:pPr>
-      <w:r>
-        <w:t xml:space="preserve">Use "Manage User Types" if you need to create or edit the permission sets assigned to users (for example Admin, Manager, Cashier).</w:t>
-      </w:r>
-    </w:p>
-    <w:p>
-      <w:pPr>
-        <w:pStyle w:val="ListParagraph"/>
-        <w:numPr>
-          <w:ilvl w:val="0"/>
-          <w:numId w:val="2"/>
-        </w:numPr>
-        <w:spacing w:after="80"/>
-      </w:pPr>
-      <w:r>
-        <w:t xml:space="preserve">Click a user's row actions to edit their details or deactivate their account.</w:t>
-      </w:r>
-    </w:p>
-    <w:p>
-      <w:pPr>
-        <w:pStyle w:val="ListParagraph"/>
-        <w:numPr>
-          <w:ilvl w:val="0"/>
-          <w:numId w:val="2"/>
-        </w:numPr>
-        <w:spacing w:after="80"/>
-      </w:pPr>
-      <w:r>
-        <w:t xml:space="preserve">Switch to the "Activity Logs" tab to see an audit trail of actions taken across Inventory, Sales, Customers, Purchases, Suppliers, Products, and more.</w:t>
+        <w:t xml:space="preserve">Figure 34: POS setup</w:t>
+      </w:r>
+    </w:p>
+    <w:p>
+      <w:pPr>
+        <w:spacing w:after="160"/>
+      </w:pPr>
+      <w:r>
+        <w:t xml:space="preserve">The General tab also holds the Membership settings, which control what customers pay for a loyalty card and how long that card stays valid. Cashiers cannot collect a membership fee until these are set.</w:t>
+      </w:r>
+    </w:p>
+    <w:p>
+      <w:pPr>
+        <w:pStyle w:val="ListParagraph"/>
+        <w:numPr>
+          <w:ilvl w:val="0"/>
+          <w:numId w:val="2"/>
+        </w:numPr>
+        <w:spacing w:after="80"/>
+      </w:pPr>
+      <w:r>
+        <w:t xml:space="preserve">Go to Settings → POS Setup and open the "General" tab.</w:t>
+      </w:r>
+    </w:p>
+    <w:p>
+      <w:pPr>
+        <w:pStyle w:val="ListParagraph"/>
+        <w:numPr>
+          <w:ilvl w:val="0"/>
+          <w:numId w:val="2"/>
+        </w:numPr>
+        <w:spacing w:after="80"/>
+      </w:pPr>
+      <w:r>
+        <w:t xml:space="preserve">Set "Membership Fee (₱)" — the amount charged to activate or renew a customer's loyalty card.</w:t>
+      </w:r>
+    </w:p>
+    <w:p>
+      <w:pPr>
+        <w:pStyle w:val="ListParagraph"/>
+        <w:numPr>
+          <w:ilvl w:val="0"/>
+          <w:numId w:val="2"/>
+        </w:numPr>
+        <w:spacing w:after="80"/>
+      </w:pPr>
+      <w:r>
+        <w:t xml:space="preserve">Set "Membership Duration (months)" — how long a paid membership lasts, counted from the day it is paid. The default is 12 months.</w:t>
+      </w:r>
+    </w:p>
+    <w:p>
+      <w:pPr>
+        <w:pStyle w:val="ListParagraph"/>
+        <w:numPr>
+          <w:ilvl w:val="0"/>
+          <w:numId w:val="2"/>
+        </w:numPr>
+        <w:spacing w:after="80"/>
+      </w:pPr>
+      <w:r>
+        <w:t xml:space="preserve">Click "Save Settings" at the top of the page.</w:t>
       </w:r>
     </w:p>
     <w:p>
@@ -6638,7 +6320,475 @@
           <w:i/>
           <w:iCs/>
         </w:rPr>
-        <w:t xml:space="preserve">Figure 35: User management</w:t>
+        <w:t xml:space="preserve">Figure 35: Membership fee setup</w:t>
+      </w:r>
+    </w:p>
+    <w:tbl>
+      <w:tblPr>
+        <w:tblW w:type="pct" w:w="100%"/>
+        <w:tblBorders>
+          <w:top w:val="single" w:color="999999" w:sz="4"/>
+          <w:left w:val="single" w:color="999999" w:sz="4"/>
+          <w:bottom w:val="single" w:color="999999" w:sz="4"/>
+          <w:right w:val="single" w:color="999999" w:sz="4"/>
+          <w:insideH w:val="single" w:color="auto" w:sz="4"/>
+          <w:insideV w:val="single" w:color="auto" w:sz="4"/>
+        </w:tblBorders>
+      </w:tblPr>
+      <w:tblGrid>
+        <w:gridCol w:w="100"/>
+      </w:tblGrid>
+      <w:tr>
+        <w:tc>
+          <w:tcPr>
+            <w:shd w:fill="FFF3C4" w:color="auto" w:val="clear"/>
+            <w:tcMar>
+              <w:top w:type="dxa" w:w="100"/>
+              <w:left w:type="dxa" w:w="150"/>
+              <w:bottom w:type="dxa" w:w="100"/>
+              <w:right w:type="dxa" w:w="150"/>
+            </w:tcMar>
+          </w:tcPr>
+          <w:p>
+            <w:r>
+              <w:rPr>
+                <w:b/>
+                <w:bCs/>
+              </w:rPr>
+              <w:t xml:space="preserve">Tip: </w:t>
+            </w:r>
+            <w:r>
+              <w:t xml:space="preserve">Leaving the membership fee at ₱0.00 stops cashiers from selling memberships altogether — the payment dialog at the POS refuses to confirm and points back to this tab. Set a real amount before the store starts offering memberships.</w:t>
+            </w:r>
+          </w:p>
+        </w:tc>
+      </w:tr>
+    </w:tbl>
+    <w:p/>
+    <w:p>
+      <w:pPr>
+        <w:pStyle w:val="Heading2"/>
+        <w:spacing w:before="200"/>
+      </w:pPr>
+      <w:r>
+        <w:t xml:space="preserve">Managing POS terminals</w:t>
+      </w:r>
+    </w:p>
+    <w:p>
+      <w:pPr>
+        <w:spacing w:after="160"/>
+      </w:pPr>
+      <w:r>
+        <w:t xml:space="preserve">Each physical checkout counter in your store is registered as a terminal. This lets Verdix track which terminal a sale happened on and which warehouse it draws stock from.</w:t>
+      </w:r>
+    </w:p>
+    <w:p>
+      <w:pPr>
+        <w:pStyle w:val="ListParagraph"/>
+        <w:numPr>
+          <w:ilvl w:val="0"/>
+          <w:numId w:val="2"/>
+        </w:numPr>
+        <w:spacing w:after="80"/>
+      </w:pPr>
+      <w:r>
+        <w:t xml:space="preserve">Go to Settings → POS Terminals.</w:t>
+      </w:r>
+    </w:p>
+    <w:p>
+      <w:pPr>
+        <w:pStyle w:val="ListParagraph"/>
+        <w:numPr>
+          <w:ilvl w:val="0"/>
+          <w:numId w:val="2"/>
+        </w:numPr>
+        <w:spacing w:after="80"/>
+      </w:pPr>
+      <w:r>
+        <w:t xml:space="preserve">Click the button to add a new terminal and give it a description and warehouse.</w:t>
+      </w:r>
+    </w:p>
+    <w:p>
+      <w:pPr>
+        <w:pStyle w:val="ListParagraph"/>
+        <w:numPr>
+          <w:ilvl w:val="0"/>
+          <w:numId w:val="2"/>
+        </w:numPr>
+        <w:spacing w:after="80"/>
+      </w:pPr>
+      <w:r>
+        <w:t xml:space="preserve">Use the edit action on an existing terminal card to change its details, or the delete action to remove a terminal that is no longer in use.</w:t>
+      </w:r>
+    </w:p>
+    <w:p>
+      <w:pPr>
+        <w:pStyle w:val="ListParagraph"/>
+        <w:numPr>
+          <w:ilvl w:val="0"/>
+          <w:numId w:val="2"/>
+        </w:numPr>
+        <w:spacing w:after="80"/>
+      </w:pPr>
+      <w:r>
+        <w:t xml:space="preserve">If a terminal shows a connection problem, use "Reset Connection" to clear the current link before reconnecting.</w:t>
+      </w:r>
+    </w:p>
+    <w:p>
+      <w:pPr>
+        <w:spacing w:after="40" w:before="120"/>
+        <w:jc w:val="center"/>
+      </w:pPr>
+      <w:r>
+        <w:drawing>
+          <wp:inline distT="0" distB="0" distL="0" distR="0">
+            <wp:extent cx="5715000" cy="3571875"/>
+            <wp:effectExtent t="0" r="0" b="0" l="0"/>
+            <wp:docPr id="1" name="" descr="" title=""/>
+            <wp:cNvGraphicFramePr>
+              <a:graphicFrameLocks xmlns:a="http://schemas.openxmlformats.org/drawingml/2006/main" noChangeAspect="1"/>
+            </wp:cNvGraphicFramePr>
+            <a:graphic xmlns:a="http://schemas.openxmlformats.org/drawingml/2006/main">
+              <a:graphicData uri="http://schemas.openxmlformats.org/drawingml/2006/picture">
+                <pic:pic xmlns:pic="http://schemas.openxmlformats.org/drawingml/2006/picture">
+                  <pic:nvPicPr>
+                    <pic:cNvPr id="0" name="" descr=""/>
+                    <pic:cNvPicPr>
+                      <a:picLocks noChangeAspect="1" noChangeArrowheads="1"/>
+                    </pic:cNvPicPr>
+                  </pic:nvPicPr>
+                  <pic:blipFill>
+                    <a:blip r:embed="rId42" cstate="none"/>
+                    <a:srcRect/>
+                    <a:stretch>
+                      <a:fillRect/>
+                    </a:stretch>
+                  </pic:blipFill>
+                  <pic:spPr bwMode="auto">
+                    <a:xfrm>
+                      <a:off x="0" y="0"/>
+                      <a:ext cx="5715000" cy="3571875"/>
+                    </a:xfrm>
+                    <a:prstGeom prst="rect">
+                      <a:avLst/>
+                    </a:prstGeom>
+                  </pic:spPr>
+                </pic:pic>
+              </a:graphicData>
+            </a:graphic>
+          </wp:inline>
+        </w:drawing>
+      </w:r>
+    </w:p>
+    <w:p>
+      <w:pPr>
+        <w:spacing w:after="160"/>
+        <w:jc w:val="center"/>
+      </w:pPr>
+      <w:r>
+        <w:rPr>
+          <w:i/>
+          <w:iCs/>
+        </w:rPr>
+        <w:t xml:space="preserve">Figure 36: POS terminals</w:t>
+      </w:r>
+    </w:p>
+    <w:p>
+      <w:pPr>
+        <w:pStyle w:val="Heading2"/>
+        <w:spacing w:before="200"/>
+      </w:pPr>
+      <w:r>
+        <w:t xml:space="preserve">Tax rates</w:t>
+      </w:r>
+    </w:p>
+    <w:p>
+      <w:pPr>
+        <w:spacing w:after="160"/>
+      </w:pPr>
+      <w:r>
+        <w:t xml:space="preserve">The Tax Rates page manages the VAT and other tax rates applied to sales, plus your store's VAT registration type, which controls whether receipts print "VAT REG TIN" or "NON-VAT REG TIN" in the header.</w:t>
+      </w:r>
+    </w:p>
+    <w:p>
+      <w:pPr>
+        <w:pStyle w:val="ListParagraph"/>
+        <w:numPr>
+          <w:ilvl w:val="0"/>
+          <w:numId w:val="2"/>
+        </w:numPr>
+        <w:spacing w:after="80"/>
+      </w:pPr>
+      <w:r>
+        <w:t xml:space="preserve">Go to Settings → Tax Rates. If your store requires authentication for this page, enter admin credentials when prompted.</w:t>
+      </w:r>
+    </w:p>
+    <w:p>
+      <w:pPr>
+        <w:pStyle w:val="ListParagraph"/>
+        <w:numPr>
+          <w:ilvl w:val="0"/>
+          <w:numId w:val="2"/>
+        </w:numPr>
+        <w:spacing w:after="80"/>
+      </w:pPr>
+      <w:r>
+        <w:t xml:space="preserve">Click the "Add Tax Rate" button, or use the edit action on an existing rate.</w:t>
+      </w:r>
+    </w:p>
+    <w:p>
+      <w:pPr>
+        <w:pStyle w:val="ListParagraph"/>
+        <w:numPr>
+          <w:ilvl w:val="0"/>
+          <w:numId w:val="2"/>
+        </w:numPr>
+        <w:spacing w:after="80"/>
+      </w:pPr>
+      <w:r>
+        <w:t xml:space="preserve">Set the "Registration Type" to "VAT Registered" or "Non-VAT Registered" as applicable to your store.</w:t>
+      </w:r>
+    </w:p>
+    <w:p>
+      <w:pPr>
+        <w:spacing w:after="40" w:before="120"/>
+        <w:jc w:val="center"/>
+      </w:pPr>
+      <w:r>
+        <w:drawing>
+          <wp:inline distT="0" distB="0" distL="0" distR="0">
+            <wp:extent cx="5715000" cy="3571875"/>
+            <wp:effectExtent t="0" r="0" b="0" l="0"/>
+            <wp:docPr id="1" name="" descr="" title=""/>
+            <wp:cNvGraphicFramePr>
+              <a:graphicFrameLocks xmlns:a="http://schemas.openxmlformats.org/drawingml/2006/main" noChangeAspect="1"/>
+            </wp:cNvGraphicFramePr>
+            <a:graphic xmlns:a="http://schemas.openxmlformats.org/drawingml/2006/main">
+              <a:graphicData uri="http://schemas.openxmlformats.org/drawingml/2006/picture">
+                <pic:pic xmlns:pic="http://schemas.openxmlformats.org/drawingml/2006/picture">
+                  <pic:nvPicPr>
+                    <pic:cNvPr id="0" name="" descr=""/>
+                    <pic:cNvPicPr>
+                      <a:picLocks noChangeAspect="1" noChangeArrowheads="1"/>
+                    </pic:cNvPicPr>
+                  </pic:nvPicPr>
+                  <pic:blipFill>
+                    <a:blip r:embed="rId43" cstate="none"/>
+                    <a:srcRect/>
+                    <a:stretch>
+                      <a:fillRect/>
+                    </a:stretch>
+                  </pic:blipFill>
+                  <pic:spPr bwMode="auto">
+                    <a:xfrm>
+                      <a:off x="0" y="0"/>
+                      <a:ext cx="5715000" cy="3571875"/>
+                    </a:xfrm>
+                    <a:prstGeom prst="rect">
+                      <a:avLst/>
+                    </a:prstGeom>
+                  </pic:spPr>
+                </pic:pic>
+              </a:graphicData>
+            </a:graphic>
+          </wp:inline>
+        </w:drawing>
+      </w:r>
+    </w:p>
+    <w:p>
+      <w:pPr>
+        <w:spacing w:after="160"/>
+        <w:jc w:val="center"/>
+      </w:pPr>
+      <w:r>
+        <w:rPr>
+          <w:i/>
+          <w:iCs/>
+        </w:rPr>
+        <w:t xml:space="preserve">Figure 37: Tax rates</w:t>
+      </w:r>
+    </w:p>
+    <w:tbl>
+      <w:tblPr>
+        <w:tblW w:type="pct" w:w="100%"/>
+        <w:tblBorders>
+          <w:top w:val="single" w:color="999999" w:sz="4"/>
+          <w:left w:val="single" w:color="999999" w:sz="4"/>
+          <w:bottom w:val="single" w:color="999999" w:sz="4"/>
+          <w:right w:val="single" w:color="999999" w:sz="4"/>
+          <w:insideH w:val="single" w:color="auto" w:sz="4"/>
+          <w:insideV w:val="single" w:color="auto" w:sz="4"/>
+        </w:tblBorders>
+      </w:tblPr>
+      <w:tblGrid>
+        <w:gridCol w:w="100"/>
+      </w:tblGrid>
+      <w:tr>
+        <w:tc>
+          <w:tcPr>
+            <w:shd w:fill="F8D0D0" w:color="auto" w:val="clear"/>
+            <w:tcMar>
+              <w:top w:type="dxa" w:w="100"/>
+              <w:left w:type="dxa" w:w="150"/>
+              <w:bottom w:type="dxa" w:w="100"/>
+              <w:right w:type="dxa" w:w="150"/>
+            </w:tcMar>
+          </w:tcPr>
+          <w:p>
+            <w:r>
+              <w:rPr>
+                <w:b/>
+                <w:bCs/>
+              </w:rPr>
+              <w:t xml:space="preserve">Warning: </w:t>
+            </w:r>
+            <w:r>
+              <w:t xml:space="preserve">Sales invoice (SI) numbers printed on receipts must be sequential with no gaps and no duplicates — this is a legal requirement for Philippine BIR tax filing. Do not attempt to renumber, delete, or reuse an invoice number; the system enforces sequential numbering automatically, so changes here should only ever add new tax rates, not alter existing invoice history.</w:t>
+            </w:r>
+          </w:p>
+        </w:tc>
+      </w:tr>
+    </w:tbl>
+    <w:p/>
+    <w:p>
+      <w:pPr>
+        <w:pStyle w:val="Heading2"/>
+        <w:spacing w:before="200"/>
+      </w:pPr>
+      <w:r>
+        <w:t xml:space="preserve">User management</w:t>
+      </w:r>
+    </w:p>
+    <w:p>
+      <w:pPr>
+        <w:spacing w:after="160"/>
+      </w:pPr>
+      <w:r>
+        <w:t xml:space="preserve">User Management controls who can log in to Verdix, what permissions they have, and lets you review an activity log of what every user has done across the system.</w:t>
+      </w:r>
+    </w:p>
+    <w:p>
+      <w:pPr>
+        <w:pStyle w:val="ListParagraph"/>
+        <w:numPr>
+          <w:ilvl w:val="0"/>
+          <w:numId w:val="2"/>
+        </w:numPr>
+        <w:spacing w:after="80"/>
+      </w:pPr>
+      <w:r>
+        <w:t xml:space="preserve">Go to User Management.</w:t>
+      </w:r>
+    </w:p>
+    <w:p>
+      <w:pPr>
+        <w:pStyle w:val="ListParagraph"/>
+        <w:numPr>
+          <w:ilvl w:val="0"/>
+          <w:numId w:val="2"/>
+        </w:numPr>
+        <w:spacing w:after="80"/>
+      </w:pPr>
+      <w:r>
+        <w:t xml:space="preserve">Click the "Add User" button, filling in their name, username, password, and user type.</w:t>
+      </w:r>
+    </w:p>
+    <w:p>
+      <w:pPr>
+        <w:pStyle w:val="ListParagraph"/>
+        <w:numPr>
+          <w:ilvl w:val="0"/>
+          <w:numId w:val="2"/>
+        </w:numPr>
+        <w:spacing w:after="80"/>
+      </w:pPr>
+      <w:r>
+        <w:t xml:space="preserve">Use "Manage User Types" if you need to create or edit the permission sets assigned to users (for example Admin, Manager, Cashier).</w:t>
+      </w:r>
+    </w:p>
+    <w:p>
+      <w:pPr>
+        <w:pStyle w:val="ListParagraph"/>
+        <w:numPr>
+          <w:ilvl w:val="0"/>
+          <w:numId w:val="2"/>
+        </w:numPr>
+        <w:spacing w:after="80"/>
+      </w:pPr>
+      <w:r>
+        <w:t xml:space="preserve">Click a user's row actions to edit their details or deactivate their account.</w:t>
+      </w:r>
+    </w:p>
+    <w:p>
+      <w:pPr>
+        <w:pStyle w:val="ListParagraph"/>
+        <w:numPr>
+          <w:ilvl w:val="0"/>
+          <w:numId w:val="2"/>
+        </w:numPr>
+        <w:spacing w:after="80"/>
+      </w:pPr>
+      <w:r>
+        <w:t xml:space="preserve">Switch to the "Activity Logs" tab to see an audit trail of actions taken across Inventory, Sales, Customers, Purchases, Suppliers, Products, and more.</w:t>
+      </w:r>
+    </w:p>
+    <w:p>
+      <w:pPr>
+        <w:spacing w:after="40" w:before="120"/>
+        <w:jc w:val="center"/>
+      </w:pPr>
+      <w:r>
+        <w:drawing>
+          <wp:inline distT="0" distB="0" distL="0" distR="0">
+            <wp:extent cx="5715000" cy="3571875"/>
+            <wp:effectExtent t="0" r="0" b="0" l="0"/>
+            <wp:docPr id="1" name="" descr="" title=""/>
+            <wp:cNvGraphicFramePr>
+              <a:graphicFrameLocks xmlns:a="http://schemas.openxmlformats.org/drawingml/2006/main" noChangeAspect="1"/>
+            </wp:cNvGraphicFramePr>
+            <a:graphic xmlns:a="http://schemas.openxmlformats.org/drawingml/2006/main">
+              <a:graphicData uri="http://schemas.openxmlformats.org/drawingml/2006/picture">
+                <pic:pic xmlns:pic="http://schemas.openxmlformats.org/drawingml/2006/picture">
+                  <pic:nvPicPr>
+                    <pic:cNvPr id="0" name="" descr=""/>
+                    <pic:cNvPicPr>
+                      <a:picLocks noChangeAspect="1" noChangeArrowheads="1"/>
+                    </pic:cNvPicPr>
+                  </pic:nvPicPr>
+                  <pic:blipFill>
+                    <a:blip r:embed="rId44" cstate="none"/>
+                    <a:srcRect/>
+                    <a:stretch>
+                      <a:fillRect/>
+                    </a:stretch>
+                  </pic:blipFill>
+                  <pic:spPr bwMode="auto">
+                    <a:xfrm>
+                      <a:off x="0" y="0"/>
+                      <a:ext cx="5715000" cy="3571875"/>
+                    </a:xfrm>
+                    <a:prstGeom prst="rect">
+                      <a:avLst/>
+                    </a:prstGeom>
+                  </pic:spPr>
+                </pic:pic>
+              </a:graphicData>
+            </a:graphic>
+          </wp:inline>
+        </w:drawing>
+      </w:r>
+    </w:p>
+    <w:p>
+      <w:pPr>
+        <w:spacing w:after="160"/>
+        <w:jc w:val="center"/>
+      </w:pPr>
+      <w:r>
+        <w:rPr>
+          <w:i/>
+          <w:iCs/>
+        </w:rPr>
+        <w:t xml:space="preserve">Figure 38: User management</w:t>
       </w:r>
     </w:p>
     <w:tbl>

</xml_diff>